<commit_message>
Architecture, Test & Bug Report
</commit_message>
<xml_diff>
--- a/Architecture & Construction Planning.docx
+++ b/Architecture & Construction Planning.docx
@@ -6,100 +6,118 @@
       <w:pPr>
         <w:jc w:val="center"/>
         <w:rPr>
+          <w:color w:val="3A3A3A" w:themeColor="background2" w:themeShade="40"/>
+          <w:sz w:val="40"/>
+          <w:szCs w:val="40"/>
+        </w:rPr>
+      </w:pPr>
+      <w:proofErr w:type="spellStart"/>
+      <w:r>
+        <w:rPr>
+          <w:color w:val="3A3A3A" w:themeColor="background2" w:themeShade="40"/>
+          <w:sz w:val="40"/>
+          <w:szCs w:val="40"/>
+        </w:rPr>
+        <w:t>ExpenseMate</w:t>
+      </w:r>
+      <w:proofErr w:type="spellEnd"/>
+      <w:r>
+        <w:rPr>
+          <w:color w:val="3A3A3A" w:themeColor="background2" w:themeShade="40"/>
+          <w:sz w:val="40"/>
+          <w:szCs w:val="40"/>
+        </w:rPr>
+        <w:t xml:space="preserve"> - Architecture &amp; Construction Planning</w:t>
+      </w:r>
+    </w:p>
+    <w:p>
+      <w:pPr>
+        <w:jc w:val="center"/>
+        <w:rPr>
+          <w:color w:val="3A3A3A" w:themeColor="background2" w:themeShade="40"/>
+          <w:sz w:val="28"/>
+          <w:szCs w:val="28"/>
+        </w:rPr>
+      </w:pPr>
+      <w:r>
+        <w:rPr>
+          <w:color w:val="3A3A3A" w:themeColor="background2" w:themeShade="40"/>
+          <w:sz w:val="28"/>
+          <w:szCs w:val="28"/>
+        </w:rPr>
+        <w:t xml:space="preserve">By: </w:t>
+      </w:r>
+      <w:r>
+        <w:rPr>
+          <w:color w:val="3A3A3A" w:themeColor="background2" w:themeShade="40"/>
+          <w:sz w:val="28"/>
+          <w:szCs w:val="28"/>
+        </w:rPr>
+        <w:t>24k-3099 &amp; 24k-3041</w:t>
+      </w:r>
+    </w:p>
+    <w:p>
+      <w:pPr>
+        <w:jc w:val="center"/>
+        <w:rPr>
+          <w:color w:val="3A3A3A" w:themeColor="background2" w:themeShade="40"/>
+          <w:sz w:val="28"/>
+          <w:szCs w:val="28"/>
+        </w:rPr>
+      </w:pPr>
+    </w:p>
+    <w:p>
+      <w:pPr>
+        <w:jc w:val="center"/>
+        <w:rPr>
+          <w:rFonts w:ascii="Abadi" w:hAnsi="Abadi"/>
           <w:sz w:val="32"/>
           <w:szCs w:val="32"/>
         </w:rPr>
       </w:pPr>
-      <w:proofErr w:type="spellStart"/>
-      <w:r>
-        <w:rPr>
-          <w:b/>
-          <w:bCs/>
+      <w:r>
+        <w:rPr>
+          <w:rFonts w:ascii="Abadi" w:hAnsi="Abadi"/>
           <w:sz w:val="32"/>
           <w:szCs w:val="32"/>
         </w:rPr>
-        <w:t>ExpenseMate</w:t>
-      </w:r>
-      <w:proofErr w:type="spellEnd"/>
-      <w:r>
-        <w:rPr>
-          <w:b/>
-          <w:bCs/>
+        <w:t>Architectural Style Selectio</w:t>
+      </w:r>
+      <w:r>
+        <w:rPr>
+          <w:rFonts w:ascii="Abadi" w:hAnsi="Abadi"/>
           <w:sz w:val="32"/>
           <w:szCs w:val="32"/>
         </w:rPr>
-        <w:t xml:space="preserve"> (24k-3099 &amp; 24k-3041)</w:t>
-      </w:r>
-    </w:p>
-    <w:p>
-      <w:pPr>
-        <w:jc w:val="center"/>
-        <w:rPr>
-          <w:b/>
-          <w:bCs/>
-          <w:sz w:val="32"/>
-          <w:szCs w:val="32"/>
-        </w:rPr>
-      </w:pPr>
-      <w:r>
-        <w:rPr>
-          <w:b/>
-          <w:bCs/>
-          <w:sz w:val="32"/>
-          <w:szCs w:val="32"/>
-        </w:rPr>
-        <w:t>Architectural Style Selection</w:t>
-      </w:r>
-    </w:p>
-    <w:p>
-      <w:pPr>
-        <w:jc w:val="center"/>
-        <w:rPr>
-          <w:sz w:val="28"/>
-          <w:szCs w:val="28"/>
-        </w:rPr>
-      </w:pPr>
-      <w:r>
-        <w:rPr>
-          <w:sz w:val="28"/>
-          <w:szCs w:val="28"/>
-        </w:rPr>
-        <w:t xml:space="preserve">For </w:t>
-      </w:r>
-      <w:proofErr w:type="spellStart"/>
-      <w:r>
-        <w:rPr>
-          <w:sz w:val="28"/>
-          <w:szCs w:val="28"/>
-        </w:rPr>
-        <w:t>ExpenseMate</w:t>
-      </w:r>
-      <w:proofErr w:type="spellEnd"/>
-      <w:r>
-        <w:rPr>
-          <w:sz w:val="28"/>
-          <w:szCs w:val="28"/>
-        </w:rPr>
-        <w:t>, a Client-Server Architecture operating alongside a Backend N-Layered Architecture is selected.</w:t>
-      </w:r>
-    </w:p>
-    <w:p>
-      <w:pPr>
-        <w:jc w:val="center"/>
-        <w:rPr>
-          <w:sz w:val="28"/>
-          <w:szCs w:val="28"/>
-        </w:rPr>
-      </w:pPr>
-      <w:r>
-        <w:rPr>
+        <w:t>n</w:t>
+      </w:r>
+      <w:r>
+        <w:rPr>
+          <w:rFonts w:ascii="Abadi" w:hAnsi="Abadi"/>
+          <w:noProof/>
           <w:sz w:val="28"/>
           <w:szCs w:val="28"/>
         </w:rPr>
         <w:drawing>
-          <wp:inline distT="0" distB="0" distL="0" distR="0" wp14:anchorId="5A219BD8" wp14:editId="42825BB0">
-            <wp:extent cx="5943600" cy="6667500"/>
-            <wp:effectExtent l="0" t="0" r="0" b="0"/>
+          <wp:anchor distT="0" distB="0" distL="114300" distR="114300" simplePos="0" relativeHeight="251658240" behindDoc="1" locked="0" layoutInCell="1" allowOverlap="1" wp14:anchorId="5A219BD8" wp14:editId="39542A22">
+            <wp:simplePos x="0" y="0"/>
+            <wp:positionH relativeFrom="margin">
+              <wp:posOffset>195580</wp:posOffset>
+            </wp:positionH>
+            <wp:positionV relativeFrom="paragraph">
+              <wp:posOffset>857250</wp:posOffset>
+            </wp:positionV>
+            <wp:extent cx="5801995" cy="6193155"/>
+            <wp:effectExtent l="0" t="0" r="8255" b="0"/>
+            <wp:wrapTight wrapText="bothSides">
+              <wp:wrapPolygon edited="0">
+                <wp:start x="0" y="0"/>
+                <wp:lineTo x="0" y="21527"/>
+                <wp:lineTo x="21560" y="21527"/>
+                <wp:lineTo x="21560" y="0"/>
+                <wp:lineTo x="0" y="0"/>
+              </wp:wrapPolygon>
+            </wp:wrapTight>
             <wp:docPr id="2009564508" name="Picture 2"/>
             <wp:cNvGraphicFramePr>
               <a:graphicFrameLocks xmlns:a="http://schemas.openxmlformats.org/drawingml/2006/main" noChangeAspect="1"/>
@@ -113,7 +131,7 @@
                       <a:picLocks noChangeAspect="1" noChangeArrowheads="1"/>
                     </pic:cNvPicPr>
                   </pic:nvPicPr>
-                  <pic:blipFill>
+                  <pic:blipFill rotWithShape="1">
                     <a:blip r:embed="rId5" cstate="print">
                       <a:extLst>
                         <a:ext uri="{28A0092B-C50C-407E-A947-70E740481C1C}">
@@ -121,7 +139,7 @@
                         </a:ext>
                       </a:extLst>
                     </a:blip>
-                    <a:srcRect/>
+                    <a:srcRect t="4538" b="284"/>
                     <a:stretch>
                       <a:fillRect/>
                     </a:stretch>
@@ -129,7 +147,7 @@
                   <pic:spPr bwMode="auto">
                     <a:xfrm>
                       <a:off x="0" y="0"/>
-                      <a:ext cx="5943600" cy="6667500"/>
+                      <a:ext cx="5801995" cy="6193155"/>
                     </a:xfrm>
                     <a:prstGeom prst="rect">
                       <a:avLst/>
@@ -138,11 +156,22 @@
                     <a:ln>
                       <a:noFill/>
                     </a:ln>
+                    <a:extLst>
+                      <a:ext uri="{53640926-AAD7-44D8-BBD7-CCE9431645EC}">
+                        <a14:shadowObscured xmlns:a14="http://schemas.microsoft.com/office/drawing/2010/main"/>
+                      </a:ext>
+                    </a:extLst>
                   </pic:spPr>
                 </pic:pic>
               </a:graphicData>
             </a:graphic>
-          </wp:inline>
+            <wp14:sizeRelH relativeFrom="margin">
+              <wp14:pctWidth>0</wp14:pctWidth>
+            </wp14:sizeRelH>
+            <wp14:sizeRelV relativeFrom="margin">
+              <wp14:pctHeight>0</wp14:pctHeight>
+            </wp14:sizeRelV>
+          </wp:anchor>
         </w:drawing>
       </w:r>
     </w:p>
@@ -150,22 +179,568 @@
       <w:pPr>
         <w:jc w:val="center"/>
         <w:rPr>
+          <w:sz w:val="28"/>
+          <w:szCs w:val="28"/>
+        </w:rPr>
+      </w:pPr>
+      <w:r>
+        <w:rPr>
+          <w:sz w:val="28"/>
+          <w:szCs w:val="28"/>
+        </w:rPr>
+        <w:t xml:space="preserve">For </w:t>
+      </w:r>
+      <w:proofErr w:type="spellStart"/>
+      <w:r>
+        <w:rPr>
+          <w:sz w:val="28"/>
+          <w:szCs w:val="28"/>
+        </w:rPr>
+        <w:t>ExpenseMate</w:t>
+      </w:r>
+      <w:proofErr w:type="spellEnd"/>
+      <w:r>
+        <w:rPr>
+          <w:sz w:val="28"/>
+          <w:szCs w:val="28"/>
+        </w:rPr>
+        <w:t>, a Client-Server Architecture operating alongside a Backend N-Layered Architecture is selected.</w:t>
+      </w:r>
+    </w:p>
+    <w:p>
+      <w:pPr>
+        <w:jc w:val="center"/>
+        <w:rPr>
+          <w:rFonts w:ascii="Abadi" w:hAnsi="Abadi"/>
+          <w:sz w:val="32"/>
+          <w:szCs w:val="32"/>
+        </w:rPr>
+      </w:pPr>
+      <w:r>
+        <w:rPr>
+          <w:rFonts w:ascii="Abadi" w:hAnsi="Abadi"/>
+          <w:sz w:val="32"/>
+          <w:szCs w:val="32"/>
+        </w:rPr>
+        <w:lastRenderedPageBreak/>
+        <w:t>Architectural Views (4+1 View Model)</w:t>
+      </w:r>
+    </w:p>
+    <w:p>
+      <w:pPr>
+        <w:jc w:val="center"/>
+        <w:rPr>
+          <w:rFonts w:ascii="Abadi" w:hAnsi="Abadi"/>
+          <w:sz w:val="32"/>
+          <w:szCs w:val="32"/>
+        </w:rPr>
+      </w:pPr>
+    </w:p>
+    <w:p>
+      <w:pPr>
+        <w:rPr>
+          <w:rFonts w:ascii="Abadi" w:hAnsi="Abadi"/>
           <w:b/>
           <w:bCs/>
-          <w:sz w:val="32"/>
-          <w:szCs w:val="32"/>
-        </w:rPr>
-      </w:pPr>
-      <w:r>
-        <w:rPr>
+          <w:sz w:val="28"/>
+          <w:szCs w:val="28"/>
+        </w:rPr>
+      </w:pPr>
+      <w:r>
+        <w:rPr>
+          <w:rFonts w:ascii="Abadi" w:hAnsi="Abadi"/>
           <w:b/>
           <w:bCs/>
-          <w:sz w:val="32"/>
-          <w:szCs w:val="32"/>
-        </w:rPr>
-        <w:lastRenderedPageBreak/>
-        <w:t>Architectural Views (4+1 View Model)</w:t>
-      </w:r>
+          <w:sz w:val="28"/>
+          <w:szCs w:val="28"/>
+        </w:rPr>
+        <w:t>Logical View</w:t>
+      </w:r>
+    </w:p>
+    <w:p>
+      <w:pPr>
+        <w:rPr>
+          <w:sz w:val="28"/>
+          <w:szCs w:val="28"/>
+        </w:rPr>
+      </w:pPr>
+      <w:r>
+        <w:rPr>
+          <w:sz w:val="28"/>
+          <w:szCs w:val="28"/>
+        </w:rPr>
+        <w:t>Decomposes the system into functional components and layer responsibilities:</w:t>
+      </w:r>
+    </w:p>
+    <w:p>
+      <w:pPr>
+        <w:rPr>
+          <w:sz w:val="22"/>
+          <w:szCs w:val="22"/>
+        </w:rPr>
+      </w:pPr>
+      <w:proofErr w:type="spellStart"/>
+      <w:r>
+        <w:rPr>
+          <w:rFonts w:ascii="Consolas" w:eastAsia="Consolas" w:hAnsi="Consolas" w:cs="Consolas"/>
+          <w:sz w:val="22"/>
+          <w:szCs w:val="22"/>
+        </w:rPr>
+        <w:t>ExpenseMate</w:t>
+      </w:r>
+      <w:proofErr w:type="spellEnd"/>
+    </w:p>
+    <w:p>
+      <w:pPr>
+        <w:rPr>
+          <w:sz w:val="22"/>
+          <w:szCs w:val="22"/>
+        </w:rPr>
+      </w:pPr>
+      <w:r>
+        <w:rPr>
+          <w:rFonts w:ascii="Consolas" w:eastAsia="Consolas" w:hAnsi="Consolas" w:cs="Consolas"/>
+          <w:sz w:val="22"/>
+          <w:szCs w:val="22"/>
+        </w:rPr>
+        <w:t>├── expense-mate-</w:t>
+      </w:r>
+      <w:proofErr w:type="spellStart"/>
+      <w:r>
+        <w:rPr>
+          <w:rFonts w:ascii="Consolas" w:eastAsia="Consolas" w:hAnsi="Consolas" w:cs="Consolas"/>
+          <w:sz w:val="22"/>
+          <w:szCs w:val="22"/>
+        </w:rPr>
+        <w:t>ui</w:t>
+      </w:r>
+      <w:proofErr w:type="spellEnd"/>
+      <w:r>
+        <w:rPr>
+          <w:rFonts w:ascii="Consolas" w:eastAsia="Consolas" w:hAnsi="Consolas" w:cs="Consolas"/>
+          <w:sz w:val="22"/>
+          <w:szCs w:val="22"/>
+        </w:rPr>
+        <w:t xml:space="preserve"> (Presentation Layer)</w:t>
+      </w:r>
+    </w:p>
+    <w:p>
+      <w:pPr>
+        <w:rPr>
+          <w:sz w:val="22"/>
+          <w:szCs w:val="22"/>
+        </w:rPr>
+      </w:pPr>
+      <w:r>
+        <w:rPr>
+          <w:rFonts w:ascii="Consolas" w:eastAsia="Consolas" w:hAnsi="Consolas" w:cs="Consolas"/>
+          <w:sz w:val="22"/>
+          <w:szCs w:val="22"/>
+        </w:rPr>
+        <w:t>│   ├── Core (Models, Services, Interceptors)</w:t>
+      </w:r>
+    </w:p>
+    <w:p>
+      <w:pPr>
+        <w:rPr>
+          <w:sz w:val="22"/>
+          <w:szCs w:val="22"/>
+        </w:rPr>
+      </w:pPr>
+      <w:r>
+        <w:rPr>
+          <w:rFonts w:ascii="Consolas" w:eastAsia="Consolas" w:hAnsi="Consolas" w:cs="Consolas"/>
+          <w:sz w:val="22"/>
+          <w:szCs w:val="22"/>
+        </w:rPr>
+        <w:t>│   ├── Features (Dashboard, Expense, Income, Budget Components)</w:t>
+      </w:r>
+    </w:p>
+    <w:p>
+      <w:pPr>
+        <w:rPr>
+          <w:sz w:val="22"/>
+          <w:szCs w:val="22"/>
+        </w:rPr>
+      </w:pPr>
+      <w:r>
+        <w:rPr>
+          <w:rFonts w:ascii="Consolas" w:eastAsia="Consolas" w:hAnsi="Consolas" w:cs="Consolas"/>
+          <w:sz w:val="22"/>
+          <w:szCs w:val="22"/>
+        </w:rPr>
+        <w:t>│   └── Shared (Navbar, UI Utility Components)</w:t>
+      </w:r>
+    </w:p>
+    <w:p>
+      <w:pPr>
+        <w:rPr>
+          <w:sz w:val="22"/>
+          <w:szCs w:val="22"/>
+        </w:rPr>
+      </w:pPr>
+      <w:r>
+        <w:rPr>
+          <w:rFonts w:ascii="Consolas" w:eastAsia="Consolas" w:hAnsi="Consolas" w:cs="Consolas"/>
+          <w:sz w:val="22"/>
+          <w:szCs w:val="22"/>
+        </w:rPr>
+        <w:t xml:space="preserve">├── </w:t>
+      </w:r>
+      <w:proofErr w:type="spellStart"/>
+      <w:r>
+        <w:rPr>
+          <w:rFonts w:ascii="Consolas" w:eastAsia="Consolas" w:hAnsi="Consolas" w:cs="Consolas"/>
+          <w:sz w:val="22"/>
+          <w:szCs w:val="22"/>
+        </w:rPr>
+        <w:t>ExpenseMate.Api</w:t>
+      </w:r>
+      <w:proofErr w:type="spellEnd"/>
+      <w:r>
+        <w:rPr>
+          <w:rFonts w:ascii="Consolas" w:eastAsia="Consolas" w:hAnsi="Consolas" w:cs="Consolas"/>
+          <w:sz w:val="22"/>
+          <w:szCs w:val="22"/>
+        </w:rPr>
+        <w:t xml:space="preserve"> (API Controller Layer)</w:t>
+      </w:r>
+    </w:p>
+    <w:p>
+      <w:pPr>
+        <w:rPr>
+          <w:sz w:val="22"/>
+          <w:szCs w:val="22"/>
+        </w:rPr>
+      </w:pPr>
+      <w:r>
+        <w:rPr>
+          <w:rFonts w:ascii="Consolas" w:eastAsia="Consolas" w:hAnsi="Consolas" w:cs="Consolas"/>
+          <w:sz w:val="22"/>
+          <w:szCs w:val="22"/>
+        </w:rPr>
+        <w:t xml:space="preserve">│   ├── </w:t>
+      </w:r>
+      <w:proofErr w:type="spellStart"/>
+      <w:r>
+        <w:rPr>
+          <w:rFonts w:ascii="Consolas" w:eastAsia="Consolas" w:hAnsi="Consolas" w:cs="Consolas"/>
+          <w:sz w:val="22"/>
+          <w:szCs w:val="22"/>
+        </w:rPr>
+        <w:t>ExpenseController</w:t>
+      </w:r>
+      <w:proofErr w:type="spellEnd"/>
+      <w:r>
+        <w:rPr>
+          <w:rFonts w:ascii="Consolas" w:eastAsia="Consolas" w:hAnsi="Consolas" w:cs="Consolas"/>
+          <w:sz w:val="22"/>
+          <w:szCs w:val="22"/>
+        </w:rPr>
+        <w:t xml:space="preserve">, </w:t>
+      </w:r>
+      <w:proofErr w:type="spellStart"/>
+      <w:r>
+        <w:rPr>
+          <w:rFonts w:ascii="Consolas" w:eastAsia="Consolas" w:hAnsi="Consolas" w:cs="Consolas"/>
+          <w:sz w:val="22"/>
+          <w:szCs w:val="22"/>
+        </w:rPr>
+        <w:t>IncomeController</w:t>
+      </w:r>
+      <w:proofErr w:type="spellEnd"/>
+      <w:r>
+        <w:rPr>
+          <w:rFonts w:ascii="Consolas" w:eastAsia="Consolas" w:hAnsi="Consolas" w:cs="Consolas"/>
+          <w:sz w:val="22"/>
+          <w:szCs w:val="22"/>
+        </w:rPr>
+        <w:t xml:space="preserve">, </w:t>
+      </w:r>
+      <w:proofErr w:type="spellStart"/>
+      <w:r>
+        <w:rPr>
+          <w:rFonts w:ascii="Consolas" w:eastAsia="Consolas" w:hAnsi="Consolas" w:cs="Consolas"/>
+          <w:sz w:val="22"/>
+          <w:szCs w:val="22"/>
+        </w:rPr>
+        <w:t>BudgetController</w:t>
+      </w:r>
+      <w:proofErr w:type="spellEnd"/>
+    </w:p>
+    <w:p>
+      <w:pPr>
+        <w:rPr>
+          <w:sz w:val="22"/>
+          <w:szCs w:val="22"/>
+        </w:rPr>
+      </w:pPr>
+      <w:r>
+        <w:rPr>
+          <w:rFonts w:ascii="Consolas" w:eastAsia="Consolas" w:hAnsi="Consolas" w:cs="Consolas"/>
+          <w:sz w:val="22"/>
+          <w:szCs w:val="22"/>
+        </w:rPr>
+        <w:t xml:space="preserve">│   └── </w:t>
+      </w:r>
+      <w:proofErr w:type="spellStart"/>
+      <w:r>
+        <w:rPr>
+          <w:rFonts w:ascii="Consolas" w:eastAsia="Consolas" w:hAnsi="Consolas" w:cs="Consolas"/>
+          <w:sz w:val="22"/>
+          <w:szCs w:val="22"/>
+        </w:rPr>
+        <w:t>Program.cs</w:t>
+      </w:r>
+      <w:proofErr w:type="spellEnd"/>
+      <w:r>
+        <w:rPr>
+          <w:rFonts w:ascii="Consolas" w:eastAsia="Consolas" w:hAnsi="Consolas" w:cs="Consolas"/>
+          <w:sz w:val="22"/>
+          <w:szCs w:val="22"/>
+        </w:rPr>
+        <w:t xml:space="preserve"> (CORS Configuration, DI Container)</w:t>
+      </w:r>
+    </w:p>
+    <w:p>
+      <w:pPr>
+        <w:rPr>
+          <w:sz w:val="22"/>
+          <w:szCs w:val="22"/>
+        </w:rPr>
+      </w:pPr>
+      <w:r>
+        <w:rPr>
+          <w:rFonts w:ascii="Consolas" w:eastAsia="Consolas" w:hAnsi="Consolas" w:cs="Consolas"/>
+          <w:sz w:val="22"/>
+          <w:szCs w:val="22"/>
+        </w:rPr>
+        <w:t xml:space="preserve">├── </w:t>
+      </w:r>
+      <w:proofErr w:type="spellStart"/>
+      <w:r>
+        <w:rPr>
+          <w:rFonts w:ascii="Consolas" w:eastAsia="Consolas" w:hAnsi="Consolas" w:cs="Consolas"/>
+          <w:sz w:val="22"/>
+          <w:szCs w:val="22"/>
+        </w:rPr>
+        <w:t>ExpenseMate.Services</w:t>
+      </w:r>
+      <w:proofErr w:type="spellEnd"/>
+      <w:r>
+        <w:rPr>
+          <w:rFonts w:ascii="Consolas" w:eastAsia="Consolas" w:hAnsi="Consolas" w:cs="Consolas"/>
+          <w:sz w:val="22"/>
+          <w:szCs w:val="22"/>
+        </w:rPr>
+        <w:t xml:space="preserve"> (Business Logic Layer)</w:t>
+      </w:r>
+    </w:p>
+    <w:p>
+      <w:pPr>
+        <w:rPr>
+          <w:sz w:val="22"/>
+          <w:szCs w:val="22"/>
+        </w:rPr>
+      </w:pPr>
+      <w:r>
+        <w:rPr>
+          <w:rFonts w:ascii="Consolas" w:eastAsia="Consolas" w:hAnsi="Consolas" w:cs="Consolas"/>
+          <w:sz w:val="22"/>
+          <w:szCs w:val="22"/>
+        </w:rPr>
+        <w:t xml:space="preserve">│   └── </w:t>
+      </w:r>
+      <w:proofErr w:type="spellStart"/>
+      <w:r>
+        <w:rPr>
+          <w:rFonts w:ascii="Consolas" w:eastAsia="Consolas" w:hAnsi="Consolas" w:cs="Consolas"/>
+          <w:sz w:val="22"/>
+          <w:szCs w:val="22"/>
+        </w:rPr>
+        <w:t>ExpenseService</w:t>
+      </w:r>
+      <w:proofErr w:type="spellEnd"/>
+      <w:r>
+        <w:rPr>
+          <w:rFonts w:ascii="Consolas" w:eastAsia="Consolas" w:hAnsi="Consolas" w:cs="Consolas"/>
+          <w:sz w:val="22"/>
+          <w:szCs w:val="22"/>
+        </w:rPr>
+        <w:t xml:space="preserve">, </w:t>
+      </w:r>
+      <w:proofErr w:type="spellStart"/>
+      <w:r>
+        <w:rPr>
+          <w:rFonts w:ascii="Consolas" w:eastAsia="Consolas" w:hAnsi="Consolas" w:cs="Consolas"/>
+          <w:sz w:val="22"/>
+          <w:szCs w:val="22"/>
+        </w:rPr>
+        <w:t>IncomeService</w:t>
+      </w:r>
+      <w:proofErr w:type="spellEnd"/>
+      <w:r>
+        <w:rPr>
+          <w:rFonts w:ascii="Consolas" w:eastAsia="Consolas" w:hAnsi="Consolas" w:cs="Consolas"/>
+          <w:sz w:val="22"/>
+          <w:szCs w:val="22"/>
+        </w:rPr>
+        <w:t xml:space="preserve">, </w:t>
+      </w:r>
+      <w:proofErr w:type="spellStart"/>
+      <w:r>
+        <w:rPr>
+          <w:rFonts w:ascii="Consolas" w:eastAsia="Consolas" w:hAnsi="Consolas" w:cs="Consolas"/>
+          <w:sz w:val="22"/>
+          <w:szCs w:val="22"/>
+        </w:rPr>
+        <w:t>BudgetService</w:t>
+      </w:r>
+      <w:proofErr w:type="spellEnd"/>
+    </w:p>
+    <w:p>
+      <w:pPr>
+        <w:rPr>
+          <w:sz w:val="22"/>
+          <w:szCs w:val="22"/>
+        </w:rPr>
+      </w:pPr>
+      <w:r>
+        <w:rPr>
+          <w:rFonts w:ascii="Consolas" w:eastAsia="Consolas" w:hAnsi="Consolas" w:cs="Consolas"/>
+          <w:sz w:val="22"/>
+          <w:szCs w:val="22"/>
+        </w:rPr>
+        <w:t xml:space="preserve">├── </w:t>
+      </w:r>
+      <w:proofErr w:type="spellStart"/>
+      <w:r>
+        <w:rPr>
+          <w:rFonts w:ascii="Consolas" w:eastAsia="Consolas" w:hAnsi="Consolas" w:cs="Consolas"/>
+          <w:sz w:val="22"/>
+          <w:szCs w:val="22"/>
+        </w:rPr>
+        <w:t>ExpenseMate.Database</w:t>
+      </w:r>
+      <w:proofErr w:type="spellEnd"/>
+      <w:r>
+        <w:rPr>
+          <w:rFonts w:ascii="Consolas" w:eastAsia="Consolas" w:hAnsi="Consolas" w:cs="Consolas"/>
+          <w:sz w:val="22"/>
+          <w:szCs w:val="22"/>
+        </w:rPr>
+        <w:t xml:space="preserve"> (Data Access Layer)</w:t>
+      </w:r>
+    </w:p>
+    <w:p>
+      <w:pPr>
+        <w:rPr>
+          <w:sz w:val="22"/>
+          <w:szCs w:val="22"/>
+        </w:rPr>
+      </w:pPr>
+      <w:r>
+        <w:rPr>
+          <w:rFonts w:ascii="Consolas" w:eastAsia="Consolas" w:hAnsi="Consolas" w:cs="Consolas"/>
+          <w:sz w:val="22"/>
+          <w:szCs w:val="22"/>
+        </w:rPr>
+        <w:t xml:space="preserve">│   ├── </w:t>
+      </w:r>
+      <w:proofErr w:type="spellStart"/>
+      <w:r>
+        <w:rPr>
+          <w:rFonts w:ascii="Consolas" w:eastAsia="Consolas" w:hAnsi="Consolas" w:cs="Consolas"/>
+          <w:sz w:val="22"/>
+          <w:szCs w:val="22"/>
+        </w:rPr>
+        <w:t>ExpenseMateDbContext</w:t>
+      </w:r>
+      <w:proofErr w:type="spellEnd"/>
+      <w:r>
+        <w:rPr>
+          <w:rFonts w:ascii="Consolas" w:eastAsia="Consolas" w:hAnsi="Consolas" w:cs="Consolas"/>
+          <w:sz w:val="22"/>
+          <w:szCs w:val="22"/>
+        </w:rPr>
+        <w:t>, Repositories</w:t>
+      </w:r>
+    </w:p>
+    <w:p>
+      <w:pPr>
+        <w:rPr>
+          <w:sz w:val="22"/>
+          <w:szCs w:val="22"/>
+        </w:rPr>
+      </w:pPr>
+      <w:r>
+        <w:rPr>
+          <w:rFonts w:ascii="Consolas" w:eastAsia="Consolas" w:hAnsi="Consolas" w:cs="Consolas"/>
+          <w:sz w:val="22"/>
+          <w:szCs w:val="22"/>
+        </w:rPr>
+        <w:t>│   └── Migrations (EF Core Schema Versions)</w:t>
+      </w:r>
+    </w:p>
+    <w:p>
+      <w:pPr>
+        <w:rPr>
+          <w:sz w:val="22"/>
+          <w:szCs w:val="22"/>
+        </w:rPr>
+      </w:pPr>
+      <w:r>
+        <w:rPr>
+          <w:rFonts w:ascii="Consolas" w:eastAsia="Consolas" w:hAnsi="Consolas" w:cs="Consolas"/>
+          <w:sz w:val="22"/>
+          <w:szCs w:val="22"/>
+        </w:rPr>
+        <w:t xml:space="preserve">└── </w:t>
+      </w:r>
+      <w:proofErr w:type="spellStart"/>
+      <w:r>
+        <w:rPr>
+          <w:rFonts w:ascii="Consolas" w:eastAsia="Consolas" w:hAnsi="Consolas" w:cs="Consolas"/>
+          <w:sz w:val="22"/>
+          <w:szCs w:val="22"/>
+        </w:rPr>
+        <w:t>ExpenseMate.Domain</w:t>
+      </w:r>
+      <w:proofErr w:type="spellEnd"/>
+      <w:r>
+        <w:rPr>
+          <w:rFonts w:ascii="Consolas" w:eastAsia="Consolas" w:hAnsi="Consolas" w:cs="Consolas"/>
+          <w:sz w:val="22"/>
+          <w:szCs w:val="22"/>
+        </w:rPr>
+        <w:t xml:space="preserve"> (Core Entity Layer)</w:t>
+      </w:r>
+    </w:p>
+    <w:p>
+      <w:pPr>
+        <w:rPr>
+          <w:rFonts w:ascii="Consolas" w:eastAsia="Consolas" w:hAnsi="Consolas" w:cs="Consolas"/>
+          <w:sz w:val="22"/>
+          <w:szCs w:val="22"/>
+        </w:rPr>
+      </w:pPr>
+      <w:r>
+        <w:rPr>
+          <w:rFonts w:ascii="Consolas" w:eastAsia="Consolas" w:hAnsi="Consolas" w:cs="Consolas"/>
+          <w:sz w:val="22"/>
+          <w:szCs w:val="22"/>
+        </w:rPr>
+        <w:t xml:space="preserve">    └── Expense, Income, Budget Domain Models &amp; DTOs</w:t>
+      </w:r>
+    </w:p>
+    <w:p>
+      <w:pPr>
+        <w:rPr>
+          <w:rFonts w:ascii="Consolas" w:eastAsia="Consolas" w:hAnsi="Consolas" w:cs="Consolas"/>
+          <w:sz w:val="22"/>
+          <w:szCs w:val="22"/>
+        </w:rPr>
+      </w:pPr>
     </w:p>
     <w:p>
       <w:pPr>
@@ -176,499 +751,15 @@
           <w:szCs w:val="28"/>
         </w:rPr>
       </w:pPr>
-      <w:r>
+    </w:p>
+    <w:p>
+      <w:pPr>
         <w:rPr>
           <w:b/>
           <w:bCs/>
           <w:sz w:val="28"/>
           <w:szCs w:val="28"/>
         </w:rPr>
-        <w:t>Logical View</w:t>
-      </w:r>
-    </w:p>
-    <w:p>
-      <w:pPr>
-        <w:rPr>
-          <w:sz w:val="28"/>
-          <w:szCs w:val="28"/>
-        </w:rPr>
-      </w:pPr>
-      <w:r>
-        <w:rPr>
-          <w:sz w:val="28"/>
-          <w:szCs w:val="28"/>
-        </w:rPr>
-        <w:t>Decomposes the system into functional components and layer responsibilities:</w:t>
-      </w:r>
-    </w:p>
-    <w:p>
-      <w:pPr>
-        <w:rPr>
-          <w:sz w:val="22"/>
-          <w:szCs w:val="22"/>
-        </w:rPr>
-      </w:pPr>
-      <w:proofErr w:type="spellStart"/>
-      <w:r>
-        <w:rPr>
-          <w:rFonts w:ascii="Consolas" w:eastAsia="Consolas" w:hAnsi="Consolas" w:cs="Consolas"/>
-          <w:sz w:val="22"/>
-          <w:szCs w:val="22"/>
-        </w:rPr>
-        <w:t>ExpenseMate</w:t>
-      </w:r>
-      <w:proofErr w:type="spellEnd"/>
-    </w:p>
-    <w:p>
-      <w:pPr>
-        <w:rPr>
-          <w:sz w:val="22"/>
-          <w:szCs w:val="22"/>
-        </w:rPr>
-      </w:pPr>
-      <w:r>
-        <w:rPr>
-          <w:rFonts w:ascii="Consolas" w:eastAsia="Consolas" w:hAnsi="Consolas" w:cs="Consolas"/>
-          <w:sz w:val="22"/>
-          <w:szCs w:val="22"/>
-        </w:rPr>
-        <w:t>├── expense-mate-</w:t>
-      </w:r>
-      <w:proofErr w:type="spellStart"/>
-      <w:r>
-        <w:rPr>
-          <w:rFonts w:ascii="Consolas" w:eastAsia="Consolas" w:hAnsi="Consolas" w:cs="Consolas"/>
-          <w:sz w:val="22"/>
-          <w:szCs w:val="22"/>
-        </w:rPr>
-        <w:t>ui</w:t>
-      </w:r>
-      <w:proofErr w:type="spellEnd"/>
-      <w:r>
-        <w:rPr>
-          <w:rFonts w:ascii="Consolas" w:eastAsia="Consolas" w:hAnsi="Consolas" w:cs="Consolas"/>
-          <w:sz w:val="22"/>
-          <w:szCs w:val="22"/>
-        </w:rPr>
-        <w:t xml:space="preserve"> (Presentation Layer)</w:t>
-      </w:r>
-    </w:p>
-    <w:p>
-      <w:pPr>
-        <w:rPr>
-          <w:sz w:val="22"/>
-          <w:szCs w:val="22"/>
-        </w:rPr>
-      </w:pPr>
-      <w:r>
-        <w:rPr>
-          <w:rFonts w:ascii="Consolas" w:eastAsia="Consolas" w:hAnsi="Consolas" w:cs="Consolas"/>
-          <w:sz w:val="22"/>
-          <w:szCs w:val="22"/>
-        </w:rPr>
-        <w:t>│   ├── Core (Models, Services, Interceptors)</w:t>
-      </w:r>
-    </w:p>
-    <w:p>
-      <w:pPr>
-        <w:rPr>
-          <w:sz w:val="22"/>
-          <w:szCs w:val="22"/>
-        </w:rPr>
-      </w:pPr>
-      <w:r>
-        <w:rPr>
-          <w:rFonts w:ascii="Consolas" w:eastAsia="Consolas" w:hAnsi="Consolas" w:cs="Consolas"/>
-          <w:sz w:val="22"/>
-          <w:szCs w:val="22"/>
-        </w:rPr>
-        <w:t>│   ├── Features (Dashboard, Expense, Income, Budget Components)</w:t>
-      </w:r>
-    </w:p>
-    <w:p>
-      <w:pPr>
-        <w:rPr>
-          <w:sz w:val="22"/>
-          <w:szCs w:val="22"/>
-        </w:rPr>
-      </w:pPr>
-      <w:r>
-        <w:rPr>
-          <w:rFonts w:ascii="Consolas" w:eastAsia="Consolas" w:hAnsi="Consolas" w:cs="Consolas"/>
-          <w:sz w:val="22"/>
-          <w:szCs w:val="22"/>
-        </w:rPr>
-        <w:t>│   └── Shared (Navbar, UI Utility Components)</w:t>
-      </w:r>
-    </w:p>
-    <w:p>
-      <w:pPr>
-        <w:rPr>
-          <w:sz w:val="22"/>
-          <w:szCs w:val="22"/>
-        </w:rPr>
-      </w:pPr>
-      <w:r>
-        <w:rPr>
-          <w:rFonts w:ascii="Consolas" w:eastAsia="Consolas" w:hAnsi="Consolas" w:cs="Consolas"/>
-          <w:sz w:val="22"/>
-          <w:szCs w:val="22"/>
-        </w:rPr>
-        <w:t xml:space="preserve">├── </w:t>
-      </w:r>
-      <w:proofErr w:type="spellStart"/>
-      <w:r>
-        <w:rPr>
-          <w:rFonts w:ascii="Consolas" w:eastAsia="Consolas" w:hAnsi="Consolas" w:cs="Consolas"/>
-          <w:sz w:val="22"/>
-          <w:szCs w:val="22"/>
-        </w:rPr>
-        <w:t>ExpenseMate.Api</w:t>
-      </w:r>
-      <w:proofErr w:type="spellEnd"/>
-      <w:r>
-        <w:rPr>
-          <w:rFonts w:ascii="Consolas" w:eastAsia="Consolas" w:hAnsi="Consolas" w:cs="Consolas"/>
-          <w:sz w:val="22"/>
-          <w:szCs w:val="22"/>
-        </w:rPr>
-        <w:t xml:space="preserve"> (API Controller Layer)</w:t>
-      </w:r>
-    </w:p>
-    <w:p>
-      <w:pPr>
-        <w:rPr>
-          <w:sz w:val="22"/>
-          <w:szCs w:val="22"/>
-        </w:rPr>
-      </w:pPr>
-      <w:r>
-        <w:rPr>
-          <w:rFonts w:ascii="Consolas" w:eastAsia="Consolas" w:hAnsi="Consolas" w:cs="Consolas"/>
-          <w:sz w:val="22"/>
-          <w:szCs w:val="22"/>
-        </w:rPr>
-        <w:t xml:space="preserve">│   ├── </w:t>
-      </w:r>
-      <w:proofErr w:type="spellStart"/>
-      <w:r>
-        <w:rPr>
-          <w:rFonts w:ascii="Consolas" w:eastAsia="Consolas" w:hAnsi="Consolas" w:cs="Consolas"/>
-          <w:sz w:val="22"/>
-          <w:szCs w:val="22"/>
-        </w:rPr>
-        <w:t>ExpenseController</w:t>
-      </w:r>
-      <w:proofErr w:type="spellEnd"/>
-      <w:r>
-        <w:rPr>
-          <w:rFonts w:ascii="Consolas" w:eastAsia="Consolas" w:hAnsi="Consolas" w:cs="Consolas"/>
-          <w:sz w:val="22"/>
-          <w:szCs w:val="22"/>
-        </w:rPr>
-        <w:t xml:space="preserve">, </w:t>
-      </w:r>
-      <w:proofErr w:type="spellStart"/>
-      <w:r>
-        <w:rPr>
-          <w:rFonts w:ascii="Consolas" w:eastAsia="Consolas" w:hAnsi="Consolas" w:cs="Consolas"/>
-          <w:sz w:val="22"/>
-          <w:szCs w:val="22"/>
-        </w:rPr>
-        <w:t>IncomeController</w:t>
-      </w:r>
-      <w:proofErr w:type="spellEnd"/>
-      <w:r>
-        <w:rPr>
-          <w:rFonts w:ascii="Consolas" w:eastAsia="Consolas" w:hAnsi="Consolas" w:cs="Consolas"/>
-          <w:sz w:val="22"/>
-          <w:szCs w:val="22"/>
-        </w:rPr>
-        <w:t xml:space="preserve">, </w:t>
-      </w:r>
-      <w:proofErr w:type="spellStart"/>
-      <w:r>
-        <w:rPr>
-          <w:rFonts w:ascii="Consolas" w:eastAsia="Consolas" w:hAnsi="Consolas" w:cs="Consolas"/>
-          <w:sz w:val="22"/>
-          <w:szCs w:val="22"/>
-        </w:rPr>
-        <w:t>BudgetController</w:t>
-      </w:r>
-      <w:proofErr w:type="spellEnd"/>
-    </w:p>
-    <w:p>
-      <w:pPr>
-        <w:rPr>
-          <w:sz w:val="22"/>
-          <w:szCs w:val="22"/>
-        </w:rPr>
-      </w:pPr>
-      <w:r>
-        <w:rPr>
-          <w:rFonts w:ascii="Consolas" w:eastAsia="Consolas" w:hAnsi="Consolas" w:cs="Consolas"/>
-          <w:sz w:val="22"/>
-          <w:szCs w:val="22"/>
-        </w:rPr>
-        <w:t xml:space="preserve">│   └── </w:t>
-      </w:r>
-      <w:proofErr w:type="spellStart"/>
-      <w:r>
-        <w:rPr>
-          <w:rFonts w:ascii="Consolas" w:eastAsia="Consolas" w:hAnsi="Consolas" w:cs="Consolas"/>
-          <w:sz w:val="22"/>
-          <w:szCs w:val="22"/>
-        </w:rPr>
-        <w:t>Program.cs</w:t>
-      </w:r>
-      <w:proofErr w:type="spellEnd"/>
-      <w:r>
-        <w:rPr>
-          <w:rFonts w:ascii="Consolas" w:eastAsia="Consolas" w:hAnsi="Consolas" w:cs="Consolas"/>
-          <w:sz w:val="22"/>
-          <w:szCs w:val="22"/>
-        </w:rPr>
-        <w:t xml:space="preserve"> (CORS Configuration, DI Container)</w:t>
-      </w:r>
-    </w:p>
-    <w:p>
-      <w:pPr>
-        <w:rPr>
-          <w:sz w:val="22"/>
-          <w:szCs w:val="22"/>
-        </w:rPr>
-      </w:pPr>
-      <w:r>
-        <w:rPr>
-          <w:rFonts w:ascii="Consolas" w:eastAsia="Consolas" w:hAnsi="Consolas" w:cs="Consolas"/>
-          <w:sz w:val="22"/>
-          <w:szCs w:val="22"/>
-        </w:rPr>
-        <w:t xml:space="preserve">├── </w:t>
-      </w:r>
-      <w:proofErr w:type="spellStart"/>
-      <w:r>
-        <w:rPr>
-          <w:rFonts w:ascii="Consolas" w:eastAsia="Consolas" w:hAnsi="Consolas" w:cs="Consolas"/>
-          <w:sz w:val="22"/>
-          <w:szCs w:val="22"/>
-        </w:rPr>
-        <w:t>ExpenseMate.Services</w:t>
-      </w:r>
-      <w:proofErr w:type="spellEnd"/>
-      <w:r>
-        <w:rPr>
-          <w:rFonts w:ascii="Consolas" w:eastAsia="Consolas" w:hAnsi="Consolas" w:cs="Consolas"/>
-          <w:sz w:val="22"/>
-          <w:szCs w:val="22"/>
-        </w:rPr>
-        <w:t xml:space="preserve"> (Business Logic Layer)</w:t>
-      </w:r>
-    </w:p>
-    <w:p>
-      <w:pPr>
-        <w:rPr>
-          <w:sz w:val="22"/>
-          <w:szCs w:val="22"/>
-        </w:rPr>
-      </w:pPr>
-      <w:r>
-        <w:rPr>
-          <w:rFonts w:ascii="Consolas" w:eastAsia="Consolas" w:hAnsi="Consolas" w:cs="Consolas"/>
-          <w:sz w:val="22"/>
-          <w:szCs w:val="22"/>
-        </w:rPr>
-        <w:t xml:space="preserve">│   └── </w:t>
-      </w:r>
-      <w:proofErr w:type="spellStart"/>
-      <w:r>
-        <w:rPr>
-          <w:rFonts w:ascii="Consolas" w:eastAsia="Consolas" w:hAnsi="Consolas" w:cs="Consolas"/>
-          <w:sz w:val="22"/>
-          <w:szCs w:val="22"/>
-        </w:rPr>
-        <w:t>ExpenseService</w:t>
-      </w:r>
-      <w:proofErr w:type="spellEnd"/>
-      <w:r>
-        <w:rPr>
-          <w:rFonts w:ascii="Consolas" w:eastAsia="Consolas" w:hAnsi="Consolas" w:cs="Consolas"/>
-          <w:sz w:val="22"/>
-          <w:szCs w:val="22"/>
-        </w:rPr>
-        <w:t xml:space="preserve">, </w:t>
-      </w:r>
-      <w:proofErr w:type="spellStart"/>
-      <w:r>
-        <w:rPr>
-          <w:rFonts w:ascii="Consolas" w:eastAsia="Consolas" w:hAnsi="Consolas" w:cs="Consolas"/>
-          <w:sz w:val="22"/>
-          <w:szCs w:val="22"/>
-        </w:rPr>
-        <w:t>IncomeService</w:t>
-      </w:r>
-      <w:proofErr w:type="spellEnd"/>
-      <w:r>
-        <w:rPr>
-          <w:rFonts w:ascii="Consolas" w:eastAsia="Consolas" w:hAnsi="Consolas" w:cs="Consolas"/>
-          <w:sz w:val="22"/>
-          <w:szCs w:val="22"/>
-        </w:rPr>
-        <w:t xml:space="preserve">, </w:t>
-      </w:r>
-      <w:proofErr w:type="spellStart"/>
-      <w:r>
-        <w:rPr>
-          <w:rFonts w:ascii="Consolas" w:eastAsia="Consolas" w:hAnsi="Consolas" w:cs="Consolas"/>
-          <w:sz w:val="22"/>
-          <w:szCs w:val="22"/>
-        </w:rPr>
-        <w:t>BudgetService</w:t>
-      </w:r>
-      <w:proofErr w:type="spellEnd"/>
-    </w:p>
-    <w:p>
-      <w:pPr>
-        <w:rPr>
-          <w:sz w:val="22"/>
-          <w:szCs w:val="22"/>
-        </w:rPr>
-      </w:pPr>
-      <w:r>
-        <w:rPr>
-          <w:rFonts w:ascii="Consolas" w:eastAsia="Consolas" w:hAnsi="Consolas" w:cs="Consolas"/>
-          <w:sz w:val="22"/>
-          <w:szCs w:val="22"/>
-        </w:rPr>
-        <w:t xml:space="preserve">├── </w:t>
-      </w:r>
-      <w:proofErr w:type="spellStart"/>
-      <w:r>
-        <w:rPr>
-          <w:rFonts w:ascii="Consolas" w:eastAsia="Consolas" w:hAnsi="Consolas" w:cs="Consolas"/>
-          <w:sz w:val="22"/>
-          <w:szCs w:val="22"/>
-        </w:rPr>
-        <w:t>ExpenseMate.Database</w:t>
-      </w:r>
-      <w:proofErr w:type="spellEnd"/>
-      <w:r>
-        <w:rPr>
-          <w:rFonts w:ascii="Consolas" w:eastAsia="Consolas" w:hAnsi="Consolas" w:cs="Consolas"/>
-          <w:sz w:val="22"/>
-          <w:szCs w:val="22"/>
-        </w:rPr>
-        <w:t xml:space="preserve"> (Data Access Layer)</w:t>
-      </w:r>
-    </w:p>
-    <w:p>
-      <w:pPr>
-        <w:rPr>
-          <w:sz w:val="22"/>
-          <w:szCs w:val="22"/>
-        </w:rPr>
-      </w:pPr>
-      <w:r>
-        <w:rPr>
-          <w:rFonts w:ascii="Consolas" w:eastAsia="Consolas" w:hAnsi="Consolas" w:cs="Consolas"/>
-          <w:sz w:val="22"/>
-          <w:szCs w:val="22"/>
-        </w:rPr>
-        <w:t xml:space="preserve">│   ├── </w:t>
-      </w:r>
-      <w:proofErr w:type="spellStart"/>
-      <w:r>
-        <w:rPr>
-          <w:rFonts w:ascii="Consolas" w:eastAsia="Consolas" w:hAnsi="Consolas" w:cs="Consolas"/>
-          <w:sz w:val="22"/>
-          <w:szCs w:val="22"/>
-        </w:rPr>
-        <w:t>ExpenseMateDbContext</w:t>
-      </w:r>
-      <w:proofErr w:type="spellEnd"/>
-      <w:r>
-        <w:rPr>
-          <w:rFonts w:ascii="Consolas" w:eastAsia="Consolas" w:hAnsi="Consolas" w:cs="Consolas"/>
-          <w:sz w:val="22"/>
-          <w:szCs w:val="22"/>
-        </w:rPr>
-        <w:t>, Repositories</w:t>
-      </w:r>
-    </w:p>
-    <w:p>
-      <w:pPr>
-        <w:rPr>
-          <w:sz w:val="22"/>
-          <w:szCs w:val="22"/>
-        </w:rPr>
-      </w:pPr>
-      <w:r>
-        <w:rPr>
-          <w:rFonts w:ascii="Consolas" w:eastAsia="Consolas" w:hAnsi="Consolas" w:cs="Consolas"/>
-          <w:sz w:val="22"/>
-          <w:szCs w:val="22"/>
-        </w:rPr>
-        <w:t>│   └── Migrations (EF Core Schema Versions)</w:t>
-      </w:r>
-    </w:p>
-    <w:p>
-      <w:pPr>
-        <w:rPr>
-          <w:sz w:val="22"/>
-          <w:szCs w:val="22"/>
-        </w:rPr>
-      </w:pPr>
-      <w:r>
-        <w:rPr>
-          <w:rFonts w:ascii="Consolas" w:eastAsia="Consolas" w:hAnsi="Consolas" w:cs="Consolas"/>
-          <w:sz w:val="22"/>
-          <w:szCs w:val="22"/>
-        </w:rPr>
-        <w:t xml:space="preserve">└── </w:t>
-      </w:r>
-      <w:proofErr w:type="spellStart"/>
-      <w:r>
-        <w:rPr>
-          <w:rFonts w:ascii="Consolas" w:eastAsia="Consolas" w:hAnsi="Consolas" w:cs="Consolas"/>
-          <w:sz w:val="22"/>
-          <w:szCs w:val="22"/>
-        </w:rPr>
-        <w:t>ExpenseMate.Domain</w:t>
-      </w:r>
-      <w:proofErr w:type="spellEnd"/>
-      <w:r>
-        <w:rPr>
-          <w:rFonts w:ascii="Consolas" w:eastAsia="Consolas" w:hAnsi="Consolas" w:cs="Consolas"/>
-          <w:sz w:val="22"/>
-          <w:szCs w:val="22"/>
-        </w:rPr>
-        <w:t xml:space="preserve"> (Core Entity Layer)</w:t>
-      </w:r>
-    </w:p>
-    <w:p>
-      <w:pPr>
-        <w:rPr>
-          <w:rFonts w:ascii="Consolas" w:eastAsia="Consolas" w:hAnsi="Consolas" w:cs="Consolas"/>
-          <w:sz w:val="22"/>
-          <w:szCs w:val="22"/>
-        </w:rPr>
-      </w:pPr>
-      <w:r>
-        <w:rPr>
-          <w:rFonts w:ascii="Consolas" w:eastAsia="Consolas" w:hAnsi="Consolas" w:cs="Consolas"/>
-          <w:sz w:val="22"/>
-          <w:szCs w:val="22"/>
-        </w:rPr>
-        <w:t xml:space="preserve">    └── Expense, Income, Budget Domain Models &amp; DTOs</w:t>
-      </w:r>
-    </w:p>
-    <w:p>
-      <w:pPr>
-        <w:rPr>
-          <w:rFonts w:ascii="Consolas" w:eastAsia="Consolas" w:hAnsi="Consolas" w:cs="Consolas"/>
-          <w:sz w:val="22"/>
-          <w:szCs w:val="22"/>
-        </w:rPr>
       </w:pPr>
     </w:p>
     <w:p>
@@ -704,660 +795,646 @@
     <w:p>
       <w:pPr>
         <w:rPr>
+          <w:rFonts w:ascii="Abadi" w:hAnsi="Abadi"/>
           <w:b/>
           <w:bCs/>
           <w:sz w:val="28"/>
           <w:szCs w:val="28"/>
         </w:rPr>
       </w:pPr>
-    </w:p>
-    <w:p>
-      <w:pPr>
-        <w:rPr>
+      <w:r>
+        <w:rPr>
+          <w:rFonts w:ascii="Abadi" w:hAnsi="Abadi"/>
           <w:b/>
           <w:bCs/>
           <w:sz w:val="28"/>
           <w:szCs w:val="28"/>
         </w:rPr>
-      </w:pPr>
-    </w:p>
-    <w:p>
-      <w:pPr>
-        <w:rPr>
+        <w:lastRenderedPageBreak/>
+        <w:t>Process View</w:t>
+      </w:r>
+    </w:p>
+    <w:p>
+      <w:pPr>
+        <w:rPr>
+          <w:sz w:val="28"/>
+          <w:szCs w:val="28"/>
+        </w:rPr>
+      </w:pPr>
+      <w:r>
+        <w:rPr>
+          <w:sz w:val="28"/>
+          <w:szCs w:val="28"/>
+        </w:rPr>
+        <w:t>Traces runtime execution and data flow across tiers during a user action:</w:t>
+      </w:r>
+    </w:p>
+    <w:p>
+      <w:pPr>
+        <w:spacing w:after="0"/>
+        <w:rPr>
+          <w:sz w:val="22"/>
+          <w:szCs w:val="22"/>
+        </w:rPr>
+      </w:pPr>
+      <w:r>
+        <w:rPr>
+          <w:rFonts w:ascii="Consolas" w:eastAsia="Consolas" w:hAnsi="Consolas" w:cs="Consolas"/>
+          <w:sz w:val="22"/>
+          <w:szCs w:val="22"/>
+        </w:rPr>
+        <w:t>[User] -&gt; (Submit Expense Form)</w:t>
+      </w:r>
+    </w:p>
+    <w:p>
+      <w:pPr>
+        <w:spacing w:after="0"/>
+        <w:rPr>
+          <w:sz w:val="22"/>
+          <w:szCs w:val="22"/>
+        </w:rPr>
+      </w:pPr>
+      <w:r>
+        <w:rPr>
+          <w:rFonts w:ascii="Consolas" w:eastAsia="Consolas" w:hAnsi="Consolas" w:cs="Consolas"/>
+          <w:sz w:val="22"/>
+          <w:szCs w:val="22"/>
+        </w:rPr>
+        <w:t xml:space="preserve">   │</w:t>
+      </w:r>
+    </w:p>
+    <w:p>
+      <w:pPr>
+        <w:spacing w:after="0"/>
+        <w:rPr>
+          <w:sz w:val="22"/>
+          <w:szCs w:val="22"/>
+        </w:rPr>
+      </w:pPr>
+      <w:r>
+        <w:rPr>
+          <w:rFonts w:ascii="Consolas" w:eastAsia="Consolas" w:hAnsi="Consolas" w:cs="Consolas"/>
+          <w:sz w:val="22"/>
+          <w:szCs w:val="22"/>
+        </w:rPr>
+        <w:t xml:space="preserve">   ▼</w:t>
+      </w:r>
+    </w:p>
+    <w:p>
+      <w:pPr>
+        <w:spacing w:after="0"/>
+        <w:rPr>
+          <w:sz w:val="22"/>
+          <w:szCs w:val="22"/>
+        </w:rPr>
+      </w:pPr>
+      <w:r>
+        <w:rPr>
+          <w:rFonts w:ascii="Consolas" w:eastAsia="Consolas" w:hAnsi="Consolas" w:cs="Consolas"/>
+          <w:sz w:val="22"/>
+          <w:szCs w:val="22"/>
+        </w:rPr>
+        <w:t>[</w:t>
+      </w:r>
+      <w:proofErr w:type="spellStart"/>
+      <w:r>
+        <w:rPr>
+          <w:rFonts w:ascii="Consolas" w:eastAsia="Consolas" w:hAnsi="Consolas" w:cs="Consolas"/>
+          <w:sz w:val="22"/>
+          <w:szCs w:val="22"/>
+        </w:rPr>
+        <w:t>ExpenseComponent</w:t>
+      </w:r>
+      <w:proofErr w:type="spellEnd"/>
+      <w:r>
+        <w:rPr>
+          <w:rFonts w:ascii="Consolas" w:eastAsia="Consolas" w:hAnsi="Consolas" w:cs="Consolas"/>
+          <w:sz w:val="22"/>
+          <w:szCs w:val="22"/>
+        </w:rPr>
+        <w:t xml:space="preserve">] calls </w:t>
+      </w:r>
+      <w:proofErr w:type="spellStart"/>
+      <w:r>
+        <w:rPr>
+          <w:rFonts w:ascii="Consolas" w:eastAsia="Consolas" w:hAnsi="Consolas" w:cs="Consolas"/>
+          <w:sz w:val="22"/>
+          <w:szCs w:val="22"/>
+        </w:rPr>
+        <w:t>ExpenseService.addExpense</w:t>
+      </w:r>
+      <w:proofErr w:type="spellEnd"/>
+      <w:r>
+        <w:rPr>
+          <w:rFonts w:ascii="Consolas" w:eastAsia="Consolas" w:hAnsi="Consolas" w:cs="Consolas"/>
+          <w:sz w:val="22"/>
+          <w:szCs w:val="22"/>
+        </w:rPr>
+        <w:t>(expense)</w:t>
+      </w:r>
+    </w:p>
+    <w:p>
+      <w:pPr>
+        <w:spacing w:after="0"/>
+        <w:rPr>
+          <w:sz w:val="22"/>
+          <w:szCs w:val="22"/>
+        </w:rPr>
+      </w:pPr>
+      <w:r>
+        <w:rPr>
+          <w:rFonts w:ascii="Consolas" w:eastAsia="Consolas" w:hAnsi="Consolas" w:cs="Consolas"/>
+          <w:sz w:val="22"/>
+          <w:szCs w:val="22"/>
+        </w:rPr>
+        <w:t xml:space="preserve">   │</w:t>
+      </w:r>
+    </w:p>
+    <w:p>
+      <w:pPr>
+        <w:spacing w:after="0"/>
+        <w:rPr>
+          <w:sz w:val="22"/>
+          <w:szCs w:val="22"/>
+        </w:rPr>
+      </w:pPr>
+      <w:r>
+        <w:rPr>
+          <w:rFonts w:ascii="Consolas" w:eastAsia="Consolas" w:hAnsi="Consolas" w:cs="Consolas"/>
+          <w:sz w:val="22"/>
+          <w:szCs w:val="22"/>
+        </w:rPr>
+        <w:t xml:space="preserve">   ▼</w:t>
+      </w:r>
+    </w:p>
+    <w:p>
+      <w:pPr>
+        <w:spacing w:after="0"/>
+        <w:rPr>
+          <w:sz w:val="22"/>
+          <w:szCs w:val="22"/>
+        </w:rPr>
+      </w:pPr>
+      <w:r>
+        <w:rPr>
+          <w:rFonts w:ascii="Consolas" w:eastAsia="Consolas" w:hAnsi="Consolas" w:cs="Consolas"/>
+          <w:sz w:val="22"/>
+          <w:szCs w:val="22"/>
+        </w:rPr>
+        <w:t>[</w:t>
+      </w:r>
+      <w:proofErr w:type="spellStart"/>
+      <w:r>
+        <w:rPr>
+          <w:rFonts w:ascii="Consolas" w:eastAsia="Consolas" w:hAnsi="Consolas" w:cs="Consolas"/>
+          <w:sz w:val="22"/>
+          <w:szCs w:val="22"/>
+        </w:rPr>
+        <w:t>HttpClient</w:t>
+      </w:r>
+      <w:proofErr w:type="spellEnd"/>
+      <w:r>
+        <w:rPr>
+          <w:rFonts w:ascii="Consolas" w:eastAsia="Consolas" w:hAnsi="Consolas" w:cs="Consolas"/>
+          <w:sz w:val="22"/>
+          <w:szCs w:val="22"/>
+        </w:rPr>
+        <w:t>] sends POST https://localhost:7123/api/Expense (JSON)</w:t>
+      </w:r>
+    </w:p>
+    <w:p>
+      <w:pPr>
+        <w:spacing w:after="0"/>
+        <w:rPr>
+          <w:sz w:val="22"/>
+          <w:szCs w:val="22"/>
+        </w:rPr>
+      </w:pPr>
+      <w:r>
+        <w:rPr>
+          <w:rFonts w:ascii="Consolas" w:eastAsia="Consolas" w:hAnsi="Consolas" w:cs="Consolas"/>
+          <w:sz w:val="22"/>
+          <w:szCs w:val="22"/>
+        </w:rPr>
+        <w:t xml:space="preserve">   │</w:t>
+      </w:r>
+    </w:p>
+    <w:p>
+      <w:pPr>
+        <w:spacing w:after="0"/>
+        <w:rPr>
+          <w:sz w:val="22"/>
+          <w:szCs w:val="22"/>
+        </w:rPr>
+      </w:pPr>
+      <w:r>
+        <w:rPr>
+          <w:rFonts w:ascii="Consolas" w:eastAsia="Consolas" w:hAnsi="Consolas" w:cs="Consolas"/>
+          <w:sz w:val="22"/>
+          <w:szCs w:val="22"/>
+        </w:rPr>
+        <w:t xml:space="preserve">   ▼</w:t>
+      </w:r>
+    </w:p>
+    <w:p>
+      <w:pPr>
+        <w:spacing w:after="0"/>
+        <w:rPr>
+          <w:sz w:val="22"/>
+          <w:szCs w:val="22"/>
+        </w:rPr>
+      </w:pPr>
+      <w:r>
+        <w:rPr>
+          <w:rFonts w:ascii="Consolas" w:eastAsia="Consolas" w:hAnsi="Consolas" w:cs="Consolas"/>
+          <w:sz w:val="22"/>
+          <w:szCs w:val="22"/>
+        </w:rPr>
+        <w:t>[</w:t>
+      </w:r>
+      <w:proofErr w:type="spellStart"/>
+      <w:r>
+        <w:rPr>
+          <w:rFonts w:ascii="Consolas" w:eastAsia="Consolas" w:hAnsi="Consolas" w:cs="Consolas"/>
+          <w:sz w:val="22"/>
+          <w:szCs w:val="22"/>
+        </w:rPr>
+        <w:t>ExpenseController</w:t>
+      </w:r>
+      <w:proofErr w:type="spellEnd"/>
+      <w:r>
+        <w:rPr>
+          <w:rFonts w:ascii="Consolas" w:eastAsia="Consolas" w:hAnsi="Consolas" w:cs="Consolas"/>
+          <w:sz w:val="22"/>
+          <w:szCs w:val="22"/>
+        </w:rPr>
+        <w:t xml:space="preserve">] receives HTTP request -&gt; routes to </w:t>
+      </w:r>
+      <w:proofErr w:type="spellStart"/>
+      <w:r>
+        <w:rPr>
+          <w:rFonts w:ascii="Consolas" w:eastAsia="Consolas" w:hAnsi="Consolas" w:cs="Consolas"/>
+          <w:sz w:val="22"/>
+          <w:szCs w:val="22"/>
+        </w:rPr>
+        <w:t>ExpenseService</w:t>
+      </w:r>
+      <w:proofErr w:type="spellEnd"/>
+    </w:p>
+    <w:p>
+      <w:pPr>
+        <w:spacing w:after="0"/>
+        <w:rPr>
+          <w:sz w:val="22"/>
+          <w:szCs w:val="22"/>
+        </w:rPr>
+      </w:pPr>
+      <w:r>
+        <w:rPr>
+          <w:rFonts w:ascii="Consolas" w:eastAsia="Consolas" w:hAnsi="Consolas" w:cs="Consolas"/>
+          <w:sz w:val="22"/>
+          <w:szCs w:val="22"/>
+        </w:rPr>
+        <w:t xml:space="preserve">   │</w:t>
+      </w:r>
+    </w:p>
+    <w:p>
+      <w:pPr>
+        <w:spacing w:after="0"/>
+        <w:rPr>
+          <w:sz w:val="22"/>
+          <w:szCs w:val="22"/>
+        </w:rPr>
+      </w:pPr>
+      <w:r>
+        <w:rPr>
+          <w:rFonts w:ascii="Consolas" w:eastAsia="Consolas" w:hAnsi="Consolas" w:cs="Consolas"/>
+          <w:sz w:val="22"/>
+          <w:szCs w:val="22"/>
+        </w:rPr>
+        <w:t xml:space="preserve">   ▼</w:t>
+      </w:r>
+    </w:p>
+    <w:p>
+      <w:pPr>
+        <w:spacing w:after="0"/>
+        <w:rPr>
+          <w:sz w:val="22"/>
+          <w:szCs w:val="22"/>
+        </w:rPr>
+      </w:pPr>
+      <w:r>
+        <w:rPr>
+          <w:rFonts w:ascii="Consolas" w:eastAsia="Consolas" w:hAnsi="Consolas" w:cs="Consolas"/>
+          <w:sz w:val="22"/>
+          <w:szCs w:val="22"/>
+        </w:rPr>
+        <w:t>[</w:t>
+      </w:r>
+      <w:proofErr w:type="spellStart"/>
+      <w:r>
+        <w:rPr>
+          <w:rFonts w:ascii="Consolas" w:eastAsia="Consolas" w:hAnsi="Consolas" w:cs="Consolas"/>
+          <w:sz w:val="22"/>
+          <w:szCs w:val="22"/>
+        </w:rPr>
+        <w:t>ExpenseService</w:t>
+      </w:r>
+      <w:proofErr w:type="spellEnd"/>
+      <w:r>
+        <w:rPr>
+          <w:rFonts w:ascii="Consolas" w:eastAsia="Consolas" w:hAnsi="Consolas" w:cs="Consolas"/>
+          <w:sz w:val="22"/>
+          <w:szCs w:val="22"/>
+        </w:rPr>
+        <w:t>] validates business rules -&gt; invokes ExpenseRepository</w:t>
+      </w:r>
+    </w:p>
+    <w:p>
+      <w:pPr>
+        <w:spacing w:after="0"/>
+        <w:rPr>
+          <w:sz w:val="22"/>
+          <w:szCs w:val="22"/>
+        </w:rPr>
+      </w:pPr>
+      <w:r>
+        <w:rPr>
+          <w:rFonts w:ascii="Consolas" w:eastAsia="Consolas" w:hAnsi="Consolas" w:cs="Consolas"/>
+          <w:sz w:val="22"/>
+          <w:szCs w:val="22"/>
+        </w:rPr>
+        <w:t xml:space="preserve">   │</w:t>
+      </w:r>
+    </w:p>
+    <w:p>
+      <w:pPr>
+        <w:spacing w:after="0"/>
+        <w:rPr>
+          <w:sz w:val="22"/>
+          <w:szCs w:val="22"/>
+        </w:rPr>
+      </w:pPr>
+      <w:r>
+        <w:rPr>
+          <w:rFonts w:ascii="Consolas" w:eastAsia="Consolas" w:hAnsi="Consolas" w:cs="Consolas"/>
+          <w:sz w:val="22"/>
+          <w:szCs w:val="22"/>
+        </w:rPr>
+        <w:t xml:space="preserve">   ▼</w:t>
+      </w:r>
+    </w:p>
+    <w:p>
+      <w:pPr>
+        <w:spacing w:after="0"/>
+        <w:rPr>
+          <w:sz w:val="22"/>
+          <w:szCs w:val="22"/>
+        </w:rPr>
+      </w:pPr>
+      <w:r>
+        <w:rPr>
+          <w:rFonts w:ascii="Consolas" w:eastAsia="Consolas" w:hAnsi="Consolas" w:cs="Consolas"/>
+          <w:sz w:val="22"/>
+          <w:szCs w:val="22"/>
+        </w:rPr>
+        <w:t>[</w:t>
+      </w:r>
+      <w:proofErr w:type="spellStart"/>
+      <w:r>
+        <w:rPr>
+          <w:rFonts w:ascii="Consolas" w:eastAsia="Consolas" w:hAnsi="Consolas" w:cs="Consolas"/>
+          <w:sz w:val="22"/>
+          <w:szCs w:val="22"/>
+        </w:rPr>
+        <w:t>ExpenseMateDbContext</w:t>
+      </w:r>
+      <w:proofErr w:type="spellEnd"/>
+      <w:r>
+        <w:rPr>
+          <w:rFonts w:ascii="Consolas" w:eastAsia="Consolas" w:hAnsi="Consolas" w:cs="Consolas"/>
+          <w:sz w:val="22"/>
+          <w:szCs w:val="22"/>
+        </w:rPr>
+        <w:t xml:space="preserve">] generates SQL -&gt; executes INSERT INTO </w:t>
+      </w:r>
+      <w:proofErr w:type="spellStart"/>
+      <w:proofErr w:type="gramStart"/>
+      <w:r>
+        <w:rPr>
+          <w:rFonts w:ascii="Consolas" w:eastAsia="Consolas" w:hAnsi="Consolas" w:cs="Consolas"/>
+          <w:sz w:val="22"/>
+          <w:szCs w:val="22"/>
+        </w:rPr>
+        <w:t>dbo.Expense</w:t>
+      </w:r>
+      <w:proofErr w:type="spellEnd"/>
+      <w:proofErr w:type="gramEnd"/>
+    </w:p>
+    <w:p>
+      <w:pPr>
+        <w:spacing w:after="0"/>
+        <w:rPr>
+          <w:sz w:val="22"/>
+          <w:szCs w:val="22"/>
+        </w:rPr>
+      </w:pPr>
+      <w:r>
+        <w:rPr>
+          <w:rFonts w:ascii="Consolas" w:eastAsia="Consolas" w:hAnsi="Consolas" w:cs="Consolas"/>
+          <w:sz w:val="22"/>
+          <w:szCs w:val="22"/>
+        </w:rPr>
+        <w:t xml:space="preserve">   │</w:t>
+      </w:r>
+    </w:p>
+    <w:p>
+      <w:pPr>
+        <w:spacing w:after="0"/>
+        <w:rPr>
+          <w:sz w:val="22"/>
+          <w:szCs w:val="22"/>
+        </w:rPr>
+      </w:pPr>
+      <w:r>
+        <w:rPr>
+          <w:rFonts w:ascii="Consolas" w:eastAsia="Consolas" w:hAnsi="Consolas" w:cs="Consolas"/>
+          <w:sz w:val="22"/>
+          <w:szCs w:val="22"/>
+        </w:rPr>
+        <w:t xml:space="preserve">   ▼</w:t>
+      </w:r>
+    </w:p>
+    <w:p>
+      <w:pPr>
+        <w:spacing w:after="0"/>
+        <w:rPr>
+          <w:sz w:val="22"/>
+          <w:szCs w:val="22"/>
+        </w:rPr>
+      </w:pPr>
+      <w:r>
+        <w:rPr>
+          <w:rFonts w:ascii="Consolas" w:eastAsia="Consolas" w:hAnsi="Consolas" w:cs="Consolas"/>
+          <w:sz w:val="22"/>
+          <w:szCs w:val="22"/>
+        </w:rPr>
+        <w:t xml:space="preserve">[SQL Server Express] persists record -&gt; returns generated </w:t>
+      </w:r>
+      <w:proofErr w:type="spellStart"/>
+      <w:r>
+        <w:rPr>
+          <w:rFonts w:ascii="Consolas" w:eastAsia="Consolas" w:hAnsi="Consolas" w:cs="Consolas"/>
+          <w:sz w:val="22"/>
+          <w:szCs w:val="22"/>
+        </w:rPr>
+        <w:t>ExpenseId</w:t>
+      </w:r>
+      <w:proofErr w:type="spellEnd"/>
+    </w:p>
+    <w:p>
+      <w:pPr>
+        <w:spacing w:after="0"/>
+        <w:rPr>
+          <w:sz w:val="22"/>
+          <w:szCs w:val="22"/>
+        </w:rPr>
+      </w:pPr>
+      <w:r>
+        <w:rPr>
+          <w:rFonts w:ascii="Consolas" w:eastAsia="Consolas" w:hAnsi="Consolas" w:cs="Consolas"/>
+          <w:sz w:val="22"/>
+          <w:szCs w:val="22"/>
+        </w:rPr>
+        <w:t xml:space="preserve">   │</w:t>
+      </w:r>
+    </w:p>
+    <w:p>
+      <w:pPr>
+        <w:spacing w:after="0"/>
+        <w:rPr>
+          <w:sz w:val="22"/>
+          <w:szCs w:val="22"/>
+        </w:rPr>
+      </w:pPr>
+      <w:r>
+        <w:rPr>
+          <w:rFonts w:ascii="Consolas" w:eastAsia="Consolas" w:hAnsi="Consolas" w:cs="Consolas"/>
+          <w:sz w:val="22"/>
+          <w:szCs w:val="22"/>
+        </w:rPr>
+        <w:t xml:space="preserve">   ▼</w:t>
+      </w:r>
+    </w:p>
+    <w:p>
+      <w:pPr>
+        <w:spacing w:after="0" w:line="240" w:lineRule="auto"/>
+        <w:rPr>
+          <w:rFonts w:ascii="Consolas" w:eastAsia="Consolas" w:hAnsi="Consolas" w:cs="Consolas"/>
+          <w:sz w:val="22"/>
+          <w:szCs w:val="22"/>
+        </w:rPr>
+      </w:pPr>
+      <w:r>
+        <w:rPr>
+          <w:rFonts w:ascii="Consolas" w:eastAsia="Consolas" w:hAnsi="Consolas" w:cs="Consolas"/>
+          <w:sz w:val="22"/>
+          <w:szCs w:val="22"/>
+        </w:rPr>
+        <w:t>[</w:t>
+      </w:r>
+      <w:proofErr w:type="spellStart"/>
+      <w:r>
+        <w:rPr>
+          <w:rFonts w:ascii="Consolas" w:eastAsia="Consolas" w:hAnsi="Consolas" w:cs="Consolas"/>
+          <w:sz w:val="22"/>
+          <w:szCs w:val="22"/>
+        </w:rPr>
+        <w:t>ExpenseController</w:t>
+      </w:r>
+      <w:proofErr w:type="spellEnd"/>
+      <w:r>
+        <w:rPr>
+          <w:rFonts w:ascii="Consolas" w:eastAsia="Consolas" w:hAnsi="Consolas" w:cs="Consolas"/>
+          <w:sz w:val="22"/>
+          <w:szCs w:val="22"/>
+        </w:rPr>
+        <w:t>] returns HTTP 201 Created -&gt; Angular updates UI state</w:t>
+      </w:r>
+    </w:p>
+    <w:p>
+      <w:pPr>
+        <w:spacing w:after="0" w:line="240" w:lineRule="auto"/>
+        <w:rPr>
+          <w:rFonts w:ascii="Consolas" w:eastAsia="Consolas" w:hAnsi="Consolas" w:cs="Consolas"/>
+          <w:sz w:val="16"/>
+          <w:szCs w:val="16"/>
+        </w:rPr>
+      </w:pPr>
+    </w:p>
+    <w:p>
+      <w:pPr>
+        <w:spacing w:after="0" w:line="240" w:lineRule="auto"/>
+        <w:rPr>
+          <w:rFonts w:ascii="Consolas" w:eastAsia="Consolas" w:hAnsi="Consolas" w:cs="Consolas"/>
+          <w:sz w:val="16"/>
+          <w:szCs w:val="16"/>
+        </w:rPr>
+      </w:pPr>
+    </w:p>
+    <w:p>
+      <w:pPr>
+        <w:spacing w:after="0" w:line="240" w:lineRule="auto"/>
+        <w:rPr>
+          <w:rFonts w:ascii="Consolas" w:eastAsia="Consolas" w:hAnsi="Consolas" w:cs="Consolas"/>
+          <w:sz w:val="16"/>
+          <w:szCs w:val="16"/>
+        </w:rPr>
+      </w:pPr>
+    </w:p>
+    <w:p>
+      <w:pPr>
+        <w:spacing w:after="0" w:line="240" w:lineRule="auto"/>
+        <w:rPr>
+          <w:rFonts w:ascii="Consolas" w:eastAsia="Consolas" w:hAnsi="Consolas" w:cs="Consolas"/>
+          <w:sz w:val="16"/>
+          <w:szCs w:val="16"/>
+        </w:rPr>
+      </w:pPr>
+    </w:p>
+    <w:p>
+      <w:pPr>
+        <w:spacing w:after="0" w:line="240" w:lineRule="auto"/>
+        <w:rPr>
+          <w:rFonts w:ascii="Abadi" w:hAnsi="Abadi"/>
           <w:b/>
           <w:bCs/>
           <w:sz w:val="28"/>
           <w:szCs w:val="28"/>
         </w:rPr>
       </w:pPr>
-    </w:p>
-    <w:p>
-      <w:pPr>
-        <w:rPr>
+      <w:r>
+        <w:rPr>
+          <w:rFonts w:ascii="Abadi" w:hAnsi="Abadi"/>
           <w:b/>
           <w:bCs/>
           <w:sz w:val="28"/>
           <w:szCs w:val="28"/>
         </w:rPr>
-      </w:pPr>
-      <w:r>
-        <w:rPr>
+        <w:t>Physical View</w:t>
+      </w:r>
+    </w:p>
+    <w:p>
+      <w:pPr>
+        <w:spacing w:after="0" w:line="240" w:lineRule="auto"/>
+        <w:rPr>
+          <w:rFonts w:ascii="Abadi" w:hAnsi="Abadi"/>
           <w:b/>
           <w:bCs/>
           <w:sz w:val="28"/>
           <w:szCs w:val="28"/>
         </w:rPr>
-        <w:lastRenderedPageBreak/>
-        <w:t>Process View</w:t>
-      </w:r>
-    </w:p>
-    <w:p>
-      <w:pPr>
-        <w:rPr>
-          <w:sz w:val="28"/>
-          <w:szCs w:val="28"/>
-        </w:rPr>
-      </w:pPr>
-      <w:r>
-        <w:rPr>
-          <w:sz w:val="28"/>
-          <w:szCs w:val="28"/>
-        </w:rPr>
-        <w:t>Traces runtime execution and data flow across tiers during a user action:</w:t>
-      </w:r>
-    </w:p>
-    <w:p>
-      <w:pPr>
-        <w:spacing w:after="0"/>
-        <w:rPr>
-          <w:sz w:val="22"/>
-          <w:szCs w:val="22"/>
-        </w:rPr>
-      </w:pPr>
-      <w:r>
-        <w:rPr>
-          <w:rFonts w:ascii="Consolas" w:eastAsia="Consolas" w:hAnsi="Consolas" w:cs="Consolas"/>
-          <w:sz w:val="22"/>
-          <w:szCs w:val="22"/>
-        </w:rPr>
-        <w:t>[User] -&gt; (Submit Expense Form)</w:t>
-      </w:r>
-    </w:p>
-    <w:p>
-      <w:pPr>
-        <w:spacing w:after="0"/>
-        <w:rPr>
-          <w:sz w:val="22"/>
-          <w:szCs w:val="22"/>
-        </w:rPr>
-      </w:pPr>
-      <w:r>
-        <w:rPr>
-          <w:rFonts w:ascii="Consolas" w:eastAsia="Consolas" w:hAnsi="Consolas" w:cs="Consolas"/>
-          <w:sz w:val="22"/>
-          <w:szCs w:val="22"/>
-        </w:rPr>
-        <w:t xml:space="preserve">   │</w:t>
-      </w:r>
-    </w:p>
-    <w:p>
-      <w:pPr>
-        <w:spacing w:after="0"/>
-        <w:rPr>
-          <w:sz w:val="22"/>
-          <w:szCs w:val="22"/>
-        </w:rPr>
-      </w:pPr>
-      <w:r>
-        <w:rPr>
-          <w:rFonts w:ascii="Consolas" w:eastAsia="Consolas" w:hAnsi="Consolas" w:cs="Consolas"/>
-          <w:sz w:val="22"/>
-          <w:szCs w:val="22"/>
-        </w:rPr>
-        <w:t xml:space="preserve">   ▼</w:t>
-      </w:r>
-    </w:p>
-    <w:p>
-      <w:pPr>
-        <w:spacing w:after="0"/>
-        <w:rPr>
-          <w:sz w:val="22"/>
-          <w:szCs w:val="22"/>
-        </w:rPr>
-      </w:pPr>
-      <w:r>
-        <w:rPr>
-          <w:rFonts w:ascii="Consolas" w:eastAsia="Consolas" w:hAnsi="Consolas" w:cs="Consolas"/>
-          <w:sz w:val="22"/>
-          <w:szCs w:val="22"/>
-        </w:rPr>
-        <w:t>[</w:t>
-      </w:r>
-      <w:proofErr w:type="spellStart"/>
-      <w:r>
-        <w:rPr>
-          <w:rFonts w:ascii="Consolas" w:eastAsia="Consolas" w:hAnsi="Consolas" w:cs="Consolas"/>
-          <w:sz w:val="22"/>
-          <w:szCs w:val="22"/>
-        </w:rPr>
-        <w:t>ExpenseComponent</w:t>
-      </w:r>
-      <w:proofErr w:type="spellEnd"/>
-      <w:r>
-        <w:rPr>
-          <w:rFonts w:ascii="Consolas" w:eastAsia="Consolas" w:hAnsi="Consolas" w:cs="Consolas"/>
-          <w:sz w:val="22"/>
-          <w:szCs w:val="22"/>
-        </w:rPr>
-        <w:t xml:space="preserve">] calls </w:t>
-      </w:r>
-      <w:proofErr w:type="spellStart"/>
-      <w:r>
-        <w:rPr>
-          <w:rFonts w:ascii="Consolas" w:eastAsia="Consolas" w:hAnsi="Consolas" w:cs="Consolas"/>
-          <w:sz w:val="22"/>
-          <w:szCs w:val="22"/>
-        </w:rPr>
-        <w:t>ExpenseService.addExpense</w:t>
-      </w:r>
-      <w:proofErr w:type="spellEnd"/>
-      <w:r>
-        <w:rPr>
-          <w:rFonts w:ascii="Consolas" w:eastAsia="Consolas" w:hAnsi="Consolas" w:cs="Consolas"/>
-          <w:sz w:val="22"/>
-          <w:szCs w:val="22"/>
-        </w:rPr>
-        <w:t>(expense)</w:t>
-      </w:r>
-    </w:p>
-    <w:p>
-      <w:pPr>
-        <w:spacing w:after="0"/>
-        <w:rPr>
-          <w:sz w:val="22"/>
-          <w:szCs w:val="22"/>
-        </w:rPr>
-      </w:pPr>
-      <w:r>
-        <w:rPr>
-          <w:rFonts w:ascii="Consolas" w:eastAsia="Consolas" w:hAnsi="Consolas" w:cs="Consolas"/>
-          <w:sz w:val="22"/>
-          <w:szCs w:val="22"/>
-        </w:rPr>
-        <w:t xml:space="preserve">   │</w:t>
-      </w:r>
-    </w:p>
-    <w:p>
-      <w:pPr>
-        <w:spacing w:after="0"/>
-        <w:rPr>
-          <w:sz w:val="22"/>
-          <w:szCs w:val="22"/>
-        </w:rPr>
-      </w:pPr>
-      <w:r>
-        <w:rPr>
-          <w:rFonts w:ascii="Consolas" w:eastAsia="Consolas" w:hAnsi="Consolas" w:cs="Consolas"/>
-          <w:sz w:val="22"/>
-          <w:szCs w:val="22"/>
-        </w:rPr>
-        <w:t xml:space="preserve">   ▼</w:t>
-      </w:r>
-    </w:p>
-    <w:p>
-      <w:pPr>
-        <w:spacing w:after="0"/>
-        <w:rPr>
-          <w:sz w:val="22"/>
-          <w:szCs w:val="22"/>
-        </w:rPr>
-      </w:pPr>
-      <w:r>
-        <w:rPr>
-          <w:rFonts w:ascii="Consolas" w:eastAsia="Consolas" w:hAnsi="Consolas" w:cs="Consolas"/>
-          <w:sz w:val="22"/>
-          <w:szCs w:val="22"/>
-        </w:rPr>
-        <w:t>[</w:t>
-      </w:r>
-      <w:proofErr w:type="spellStart"/>
-      <w:r>
-        <w:rPr>
-          <w:rFonts w:ascii="Consolas" w:eastAsia="Consolas" w:hAnsi="Consolas" w:cs="Consolas"/>
-          <w:sz w:val="22"/>
-          <w:szCs w:val="22"/>
-        </w:rPr>
-        <w:t>HttpClient</w:t>
-      </w:r>
-      <w:proofErr w:type="spellEnd"/>
-      <w:r>
-        <w:rPr>
-          <w:rFonts w:ascii="Consolas" w:eastAsia="Consolas" w:hAnsi="Consolas" w:cs="Consolas"/>
-          <w:sz w:val="22"/>
-          <w:szCs w:val="22"/>
-        </w:rPr>
-        <w:t>] sends POST https://localhost:7123/api/Expense (JSON)</w:t>
-      </w:r>
-    </w:p>
-    <w:p>
-      <w:pPr>
-        <w:spacing w:after="0"/>
-        <w:rPr>
-          <w:sz w:val="22"/>
-          <w:szCs w:val="22"/>
-        </w:rPr>
-      </w:pPr>
-      <w:r>
-        <w:rPr>
-          <w:rFonts w:ascii="Consolas" w:eastAsia="Consolas" w:hAnsi="Consolas" w:cs="Consolas"/>
-          <w:sz w:val="22"/>
-          <w:szCs w:val="22"/>
-        </w:rPr>
-        <w:t xml:space="preserve">   │</w:t>
-      </w:r>
-    </w:p>
-    <w:p>
-      <w:pPr>
-        <w:spacing w:after="0"/>
-        <w:rPr>
-          <w:sz w:val="22"/>
-          <w:szCs w:val="22"/>
-        </w:rPr>
-      </w:pPr>
-      <w:r>
-        <w:rPr>
-          <w:rFonts w:ascii="Consolas" w:eastAsia="Consolas" w:hAnsi="Consolas" w:cs="Consolas"/>
-          <w:sz w:val="22"/>
-          <w:szCs w:val="22"/>
-        </w:rPr>
-        <w:t xml:space="preserve">   ▼</w:t>
-      </w:r>
-    </w:p>
-    <w:p>
-      <w:pPr>
-        <w:spacing w:after="0"/>
-        <w:rPr>
-          <w:sz w:val="22"/>
-          <w:szCs w:val="22"/>
-        </w:rPr>
-      </w:pPr>
-      <w:r>
-        <w:rPr>
-          <w:rFonts w:ascii="Consolas" w:eastAsia="Consolas" w:hAnsi="Consolas" w:cs="Consolas"/>
-          <w:sz w:val="22"/>
-          <w:szCs w:val="22"/>
-        </w:rPr>
-        <w:t>[</w:t>
-      </w:r>
-      <w:proofErr w:type="spellStart"/>
-      <w:r>
-        <w:rPr>
-          <w:rFonts w:ascii="Consolas" w:eastAsia="Consolas" w:hAnsi="Consolas" w:cs="Consolas"/>
-          <w:sz w:val="22"/>
-          <w:szCs w:val="22"/>
-        </w:rPr>
-        <w:t>ExpenseController</w:t>
-      </w:r>
-      <w:proofErr w:type="spellEnd"/>
-      <w:r>
-        <w:rPr>
-          <w:rFonts w:ascii="Consolas" w:eastAsia="Consolas" w:hAnsi="Consolas" w:cs="Consolas"/>
-          <w:sz w:val="22"/>
-          <w:szCs w:val="22"/>
-        </w:rPr>
-        <w:t xml:space="preserve">] receives HTTP request -&gt; routes to </w:t>
-      </w:r>
-      <w:proofErr w:type="spellStart"/>
-      <w:r>
-        <w:rPr>
-          <w:rFonts w:ascii="Consolas" w:eastAsia="Consolas" w:hAnsi="Consolas" w:cs="Consolas"/>
-          <w:sz w:val="22"/>
-          <w:szCs w:val="22"/>
-        </w:rPr>
-        <w:t>ExpenseService</w:t>
-      </w:r>
-      <w:proofErr w:type="spellEnd"/>
-    </w:p>
-    <w:p>
-      <w:pPr>
-        <w:spacing w:after="0"/>
-        <w:rPr>
-          <w:sz w:val="22"/>
-          <w:szCs w:val="22"/>
-        </w:rPr>
-      </w:pPr>
-      <w:r>
-        <w:rPr>
-          <w:rFonts w:ascii="Consolas" w:eastAsia="Consolas" w:hAnsi="Consolas" w:cs="Consolas"/>
-          <w:sz w:val="22"/>
-          <w:szCs w:val="22"/>
-        </w:rPr>
-        <w:t xml:space="preserve">   │</w:t>
-      </w:r>
-    </w:p>
-    <w:p>
-      <w:pPr>
-        <w:spacing w:after="0"/>
-        <w:rPr>
-          <w:sz w:val="22"/>
-          <w:szCs w:val="22"/>
-        </w:rPr>
-      </w:pPr>
-      <w:r>
-        <w:rPr>
-          <w:rFonts w:ascii="Consolas" w:eastAsia="Consolas" w:hAnsi="Consolas" w:cs="Consolas"/>
-          <w:sz w:val="22"/>
-          <w:szCs w:val="22"/>
-        </w:rPr>
-        <w:t xml:space="preserve">   ▼</w:t>
-      </w:r>
-    </w:p>
-    <w:p>
-      <w:pPr>
-        <w:spacing w:after="0"/>
-        <w:rPr>
-          <w:sz w:val="22"/>
-          <w:szCs w:val="22"/>
-        </w:rPr>
-      </w:pPr>
-      <w:r>
-        <w:rPr>
-          <w:rFonts w:ascii="Consolas" w:eastAsia="Consolas" w:hAnsi="Consolas" w:cs="Consolas"/>
-          <w:sz w:val="22"/>
-          <w:szCs w:val="22"/>
-        </w:rPr>
-        <w:t>[</w:t>
-      </w:r>
-      <w:proofErr w:type="spellStart"/>
-      <w:r>
-        <w:rPr>
-          <w:rFonts w:ascii="Consolas" w:eastAsia="Consolas" w:hAnsi="Consolas" w:cs="Consolas"/>
-          <w:sz w:val="22"/>
-          <w:szCs w:val="22"/>
-        </w:rPr>
-        <w:t>ExpenseService</w:t>
-      </w:r>
-      <w:proofErr w:type="spellEnd"/>
-      <w:r>
-        <w:rPr>
-          <w:rFonts w:ascii="Consolas" w:eastAsia="Consolas" w:hAnsi="Consolas" w:cs="Consolas"/>
-          <w:sz w:val="22"/>
-          <w:szCs w:val="22"/>
-        </w:rPr>
-        <w:t>] validates business rules -&gt; invokes ExpenseRepository</w:t>
-      </w:r>
-    </w:p>
-    <w:p>
-      <w:pPr>
-        <w:spacing w:after="0"/>
-        <w:rPr>
-          <w:sz w:val="22"/>
-          <w:szCs w:val="22"/>
-        </w:rPr>
-      </w:pPr>
-      <w:r>
-        <w:rPr>
-          <w:rFonts w:ascii="Consolas" w:eastAsia="Consolas" w:hAnsi="Consolas" w:cs="Consolas"/>
-          <w:sz w:val="22"/>
-          <w:szCs w:val="22"/>
-        </w:rPr>
-        <w:t xml:space="preserve">   │</w:t>
-      </w:r>
-    </w:p>
-    <w:p>
-      <w:pPr>
-        <w:spacing w:after="0"/>
-        <w:rPr>
-          <w:sz w:val="22"/>
-          <w:szCs w:val="22"/>
-        </w:rPr>
-      </w:pPr>
-      <w:r>
-        <w:rPr>
-          <w:rFonts w:ascii="Consolas" w:eastAsia="Consolas" w:hAnsi="Consolas" w:cs="Consolas"/>
-          <w:sz w:val="22"/>
-          <w:szCs w:val="22"/>
-        </w:rPr>
-        <w:t xml:space="preserve">   ▼</w:t>
-      </w:r>
-    </w:p>
-    <w:p>
-      <w:pPr>
-        <w:spacing w:after="0"/>
-        <w:rPr>
-          <w:sz w:val="22"/>
-          <w:szCs w:val="22"/>
-        </w:rPr>
-      </w:pPr>
-      <w:r>
-        <w:rPr>
-          <w:rFonts w:ascii="Consolas" w:eastAsia="Consolas" w:hAnsi="Consolas" w:cs="Consolas"/>
-          <w:sz w:val="22"/>
-          <w:szCs w:val="22"/>
-        </w:rPr>
-        <w:t>[</w:t>
-      </w:r>
-      <w:proofErr w:type="spellStart"/>
-      <w:r>
-        <w:rPr>
-          <w:rFonts w:ascii="Consolas" w:eastAsia="Consolas" w:hAnsi="Consolas" w:cs="Consolas"/>
-          <w:sz w:val="22"/>
-          <w:szCs w:val="22"/>
-        </w:rPr>
-        <w:t>ExpenseMateDbContext</w:t>
-      </w:r>
-      <w:proofErr w:type="spellEnd"/>
-      <w:r>
-        <w:rPr>
-          <w:rFonts w:ascii="Consolas" w:eastAsia="Consolas" w:hAnsi="Consolas" w:cs="Consolas"/>
-          <w:sz w:val="22"/>
-          <w:szCs w:val="22"/>
-        </w:rPr>
-        <w:t xml:space="preserve">] generates SQL -&gt; executes INSERT INTO </w:t>
-      </w:r>
-      <w:proofErr w:type="spellStart"/>
-      <w:proofErr w:type="gramStart"/>
-      <w:r>
-        <w:rPr>
-          <w:rFonts w:ascii="Consolas" w:eastAsia="Consolas" w:hAnsi="Consolas" w:cs="Consolas"/>
-          <w:sz w:val="22"/>
-          <w:szCs w:val="22"/>
-        </w:rPr>
-        <w:t>dbo.Expense</w:t>
-      </w:r>
-      <w:proofErr w:type="spellEnd"/>
-      <w:proofErr w:type="gramEnd"/>
-    </w:p>
-    <w:p>
-      <w:pPr>
-        <w:spacing w:after="0"/>
-        <w:rPr>
-          <w:sz w:val="22"/>
-          <w:szCs w:val="22"/>
-        </w:rPr>
-      </w:pPr>
-      <w:r>
-        <w:rPr>
-          <w:rFonts w:ascii="Consolas" w:eastAsia="Consolas" w:hAnsi="Consolas" w:cs="Consolas"/>
-          <w:sz w:val="22"/>
-          <w:szCs w:val="22"/>
-        </w:rPr>
-        <w:t xml:space="preserve">   │</w:t>
-      </w:r>
-    </w:p>
-    <w:p>
-      <w:pPr>
-        <w:spacing w:after="0"/>
-        <w:rPr>
-          <w:sz w:val="22"/>
-          <w:szCs w:val="22"/>
-        </w:rPr>
-      </w:pPr>
-      <w:r>
-        <w:rPr>
-          <w:rFonts w:ascii="Consolas" w:eastAsia="Consolas" w:hAnsi="Consolas" w:cs="Consolas"/>
-          <w:sz w:val="22"/>
-          <w:szCs w:val="22"/>
-        </w:rPr>
-        <w:t xml:space="preserve">   ▼</w:t>
-      </w:r>
-    </w:p>
-    <w:p>
-      <w:pPr>
-        <w:spacing w:after="0"/>
-        <w:rPr>
-          <w:sz w:val="22"/>
-          <w:szCs w:val="22"/>
-        </w:rPr>
-      </w:pPr>
-      <w:r>
-        <w:rPr>
-          <w:rFonts w:ascii="Consolas" w:eastAsia="Consolas" w:hAnsi="Consolas" w:cs="Consolas"/>
-          <w:sz w:val="22"/>
-          <w:szCs w:val="22"/>
-        </w:rPr>
-        <w:t xml:space="preserve">[SQL Server Express] persists record -&gt; returns generated </w:t>
-      </w:r>
-      <w:proofErr w:type="spellStart"/>
-      <w:r>
-        <w:rPr>
-          <w:rFonts w:ascii="Consolas" w:eastAsia="Consolas" w:hAnsi="Consolas" w:cs="Consolas"/>
-          <w:sz w:val="22"/>
-          <w:szCs w:val="22"/>
-        </w:rPr>
-        <w:t>ExpenseId</w:t>
-      </w:r>
-      <w:proofErr w:type="spellEnd"/>
-    </w:p>
-    <w:p>
-      <w:pPr>
-        <w:spacing w:after="0"/>
-        <w:rPr>
-          <w:sz w:val="22"/>
-          <w:szCs w:val="22"/>
-        </w:rPr>
-      </w:pPr>
-      <w:r>
-        <w:rPr>
-          <w:rFonts w:ascii="Consolas" w:eastAsia="Consolas" w:hAnsi="Consolas" w:cs="Consolas"/>
-          <w:sz w:val="22"/>
-          <w:szCs w:val="22"/>
-        </w:rPr>
-        <w:t xml:space="preserve">   │</w:t>
-      </w:r>
-    </w:p>
-    <w:p>
-      <w:pPr>
-        <w:spacing w:after="0"/>
-        <w:rPr>
-          <w:sz w:val="22"/>
-          <w:szCs w:val="22"/>
-        </w:rPr>
-      </w:pPr>
-      <w:r>
-        <w:rPr>
-          <w:rFonts w:ascii="Consolas" w:eastAsia="Consolas" w:hAnsi="Consolas" w:cs="Consolas"/>
-          <w:sz w:val="22"/>
-          <w:szCs w:val="22"/>
-        </w:rPr>
-        <w:t xml:space="preserve">   ▼</w:t>
-      </w:r>
-    </w:p>
-    <w:p>
-      <w:pPr>
-        <w:spacing w:after="0" w:line="240" w:lineRule="auto"/>
-        <w:rPr>
-          <w:rFonts w:ascii="Consolas" w:eastAsia="Consolas" w:hAnsi="Consolas" w:cs="Consolas"/>
-          <w:sz w:val="22"/>
-          <w:szCs w:val="22"/>
-        </w:rPr>
-      </w:pPr>
-      <w:r>
-        <w:rPr>
-          <w:rFonts w:ascii="Consolas" w:eastAsia="Consolas" w:hAnsi="Consolas" w:cs="Consolas"/>
-          <w:sz w:val="22"/>
-          <w:szCs w:val="22"/>
-        </w:rPr>
-        <w:t>[</w:t>
-      </w:r>
-      <w:proofErr w:type="spellStart"/>
-      <w:r>
-        <w:rPr>
-          <w:rFonts w:ascii="Consolas" w:eastAsia="Consolas" w:hAnsi="Consolas" w:cs="Consolas"/>
-          <w:sz w:val="22"/>
-          <w:szCs w:val="22"/>
-        </w:rPr>
-        <w:t>ExpenseController</w:t>
-      </w:r>
-      <w:proofErr w:type="spellEnd"/>
-      <w:r>
-        <w:rPr>
-          <w:rFonts w:ascii="Consolas" w:eastAsia="Consolas" w:hAnsi="Consolas" w:cs="Consolas"/>
-          <w:sz w:val="22"/>
-          <w:szCs w:val="22"/>
-        </w:rPr>
-        <w:t>] returns HTTP 201 Created -&gt; Angular updates UI state</w:t>
-      </w:r>
-    </w:p>
-    <w:p>
-      <w:pPr>
-        <w:spacing w:after="0" w:line="240" w:lineRule="auto"/>
-        <w:rPr>
-          <w:rFonts w:ascii="Consolas" w:eastAsia="Consolas" w:hAnsi="Consolas" w:cs="Consolas"/>
-          <w:sz w:val="16"/>
-          <w:szCs w:val="16"/>
-        </w:rPr>
-      </w:pPr>
-    </w:p>
-    <w:p>
-      <w:pPr>
-        <w:spacing w:after="0" w:line="240" w:lineRule="auto"/>
-        <w:rPr>
-          <w:rFonts w:ascii="Consolas" w:eastAsia="Consolas" w:hAnsi="Consolas" w:cs="Consolas"/>
-          <w:sz w:val="16"/>
-          <w:szCs w:val="16"/>
-        </w:rPr>
-      </w:pPr>
-    </w:p>
-    <w:p>
-      <w:pPr>
-        <w:spacing w:after="0" w:line="240" w:lineRule="auto"/>
-        <w:rPr>
-          <w:rFonts w:ascii="Consolas" w:eastAsia="Consolas" w:hAnsi="Consolas" w:cs="Consolas"/>
-          <w:sz w:val="16"/>
-          <w:szCs w:val="16"/>
-        </w:rPr>
-      </w:pPr>
-    </w:p>
-    <w:p>
-      <w:pPr>
-        <w:spacing w:after="0" w:line="240" w:lineRule="auto"/>
-        <w:rPr>
-          <w:rFonts w:ascii="Consolas" w:eastAsia="Consolas" w:hAnsi="Consolas" w:cs="Consolas"/>
-          <w:sz w:val="16"/>
-          <w:szCs w:val="16"/>
-        </w:rPr>
-      </w:pPr>
-    </w:p>
-    <w:p>
-      <w:pPr>
-        <w:spacing w:after="0" w:line="240" w:lineRule="auto"/>
-        <w:rPr>
-          <w:b/>
-          <w:bCs/>
-          <w:sz w:val="28"/>
-          <w:szCs w:val="28"/>
-        </w:rPr>
-      </w:pPr>
-      <w:r>
-        <w:rPr>
-          <w:b/>
-          <w:bCs/>
-          <w:sz w:val="28"/>
-          <w:szCs w:val="28"/>
-        </w:rPr>
-        <w:t>Physical View</w:t>
-      </w:r>
+      </w:pPr>
     </w:p>
     <w:p>
       <w:pPr>
@@ -1408,12 +1485,6 @@
         <w:gridCol w:w="3307"/>
       </w:tblGrid>
       <w:tr>
-        <w:tblPrEx>
-          <w:tblCellMar>
-            <w:top w:w="0" w:type="dxa"/>
-            <w:bottom w:w="0" w:type="dxa"/>
-          </w:tblCellMar>
-        </w:tblPrEx>
         <w:trPr>
           <w:tblHeader/>
         </w:trPr>
@@ -1523,12 +1594,6 @@
         </w:tc>
       </w:tr>
       <w:tr>
-        <w:tblPrEx>
-          <w:tblCellMar>
-            <w:top w:w="0" w:type="dxa"/>
-            <w:bottom w:w="0" w:type="dxa"/>
-          </w:tblCellMar>
-        </w:tblPrEx>
         <w:tc>
           <w:tcPr>
             <w:tcW w:w="1000" w:type="pct"/>
@@ -1623,12 +1688,6 @@
         </w:tc>
       </w:tr>
       <w:tr>
-        <w:tblPrEx>
-          <w:tblCellMar>
-            <w:top w:w="0" w:type="dxa"/>
-            <w:bottom w:w="0" w:type="dxa"/>
-          </w:tblCellMar>
-        </w:tblPrEx>
         <w:tc>
           <w:tcPr>
             <w:tcW w:w="1000" w:type="pct"/>
@@ -1723,12 +1782,6 @@
         </w:tc>
       </w:tr>
       <w:tr>
-        <w:tblPrEx>
-          <w:tblCellMar>
-            <w:top w:w="0" w:type="dxa"/>
-            <w:bottom w:w="0" w:type="dxa"/>
-          </w:tblCellMar>
-        </w:tblPrEx>
         <w:tc>
           <w:tcPr>
             <w:tcW w:w="1000" w:type="pct"/>
@@ -1827,15 +1880,7 @@
       <w:pPr>
         <w:spacing w:after="0" w:line="240" w:lineRule="auto"/>
         <w:rPr>
-          <w:sz w:val="28"/>
-          <w:szCs w:val="28"/>
-        </w:rPr>
-      </w:pPr>
-    </w:p>
-    <w:p>
-      <w:pPr>
-        <w:spacing w:after="0" w:line="240" w:lineRule="auto"/>
-        <w:rPr>
+          <w:rFonts w:ascii="Abadi" w:hAnsi="Abadi"/>
           <w:b/>
           <w:bCs/>
           <w:sz w:val="28"/>
@@ -1844,11 +1889,13 @@
       </w:pPr>
       <w:r>
         <w:rPr>
+          <w:rFonts w:ascii="Abadi" w:hAnsi="Abadi"/>
           <w:b/>
           <w:bCs/>
           <w:sz w:val="28"/>
           <w:szCs w:val="28"/>
         </w:rPr>
+        <w:lastRenderedPageBreak/>
         <w:t>Deployment View</w:t>
       </w:r>
     </w:p>
@@ -1856,762 +1903,772 @@
       <w:pPr>
         <w:spacing w:after="0" w:line="240" w:lineRule="auto"/>
         <w:rPr>
-          <w:sz w:val="28"/>
-          <w:szCs w:val="28"/>
-        </w:rPr>
-      </w:pPr>
-      <w:r>
-        <w:rPr>
-          <w:sz w:val="28"/>
-          <w:szCs w:val="28"/>
-        </w:rPr>
-        <w:t xml:space="preserve">Defines how source code artifacts compile and deploy onto host nodes: </w:t>
-      </w:r>
-    </w:p>
-    <w:p>
-      <w:pPr>
-        <w:spacing w:after="0"/>
-        <w:rPr>
-          <w:sz w:val="22"/>
-          <w:szCs w:val="22"/>
-        </w:rPr>
-      </w:pPr>
-      <w:r>
-        <w:rPr>
-          <w:sz w:val="22"/>
-          <w:szCs w:val="22"/>
-        </w:rPr>
-        <w:br/>
-      </w:r>
-      <w:proofErr w:type="gramStart"/>
-      <w:r>
-        <w:rPr>
-          <w:rFonts w:ascii="Consolas" w:eastAsia="Consolas" w:hAnsi="Consolas" w:cs="Consolas"/>
-          <w:sz w:val="22"/>
-          <w:szCs w:val="22"/>
-        </w:rPr>
-        <w:t>+-</w:t>
-      </w:r>
-      <w:proofErr w:type="gramEnd"/>
-      <w:r>
-        <w:rPr>
-          <w:rFonts w:ascii="Consolas" w:eastAsia="Consolas" w:hAnsi="Consolas" w:cs="Consolas"/>
-          <w:sz w:val="22"/>
-          <w:szCs w:val="22"/>
-        </w:rPr>
-        <w:t>-----------------------------------------------------------------------+</w:t>
-      </w:r>
-    </w:p>
-    <w:p>
-      <w:pPr>
-        <w:spacing w:after="0"/>
-        <w:rPr>
-          <w:sz w:val="22"/>
-          <w:szCs w:val="22"/>
-        </w:rPr>
-      </w:pPr>
-      <w:r>
-        <w:rPr>
-          <w:rFonts w:ascii="Consolas" w:eastAsia="Consolas" w:hAnsi="Consolas" w:cs="Consolas"/>
-          <w:sz w:val="22"/>
-          <w:szCs w:val="22"/>
-        </w:rPr>
-        <w:t>| Client Machine / Node Runtime                                          |</w:t>
-      </w:r>
-    </w:p>
-    <w:p>
-      <w:pPr>
-        <w:spacing w:after="0"/>
-        <w:rPr>
-          <w:sz w:val="22"/>
-          <w:szCs w:val="22"/>
-        </w:rPr>
-      </w:pPr>
-      <w:proofErr w:type="gramStart"/>
-      <w:r>
-        <w:rPr>
-          <w:rFonts w:ascii="Consolas" w:eastAsia="Consolas" w:hAnsi="Consolas" w:cs="Consolas"/>
-          <w:sz w:val="22"/>
-          <w:szCs w:val="22"/>
-        </w:rPr>
-        <w:t>|  └</w:t>
-      </w:r>
-      <w:proofErr w:type="gramEnd"/>
-      <w:r>
-        <w:rPr>
-          <w:rFonts w:ascii="Consolas" w:eastAsia="Consolas" w:hAnsi="Consolas" w:cs="Consolas"/>
-          <w:sz w:val="22"/>
-          <w:szCs w:val="22"/>
-        </w:rPr>
-        <w:t>── /expense-mate-</w:t>
-      </w:r>
-      <w:proofErr w:type="spellStart"/>
-      <w:r>
-        <w:rPr>
-          <w:rFonts w:ascii="Consolas" w:eastAsia="Consolas" w:hAnsi="Consolas" w:cs="Consolas"/>
-          <w:sz w:val="22"/>
-          <w:szCs w:val="22"/>
-        </w:rPr>
-        <w:t>ui</w:t>
-      </w:r>
-      <w:proofErr w:type="spellEnd"/>
-      <w:r>
-        <w:rPr>
-          <w:rFonts w:ascii="Consolas" w:eastAsia="Consolas" w:hAnsi="Consolas" w:cs="Consolas"/>
-          <w:sz w:val="22"/>
-          <w:szCs w:val="22"/>
-        </w:rPr>
-        <w:t>/</w:t>
-      </w:r>
-      <w:proofErr w:type="spellStart"/>
-      <w:r>
-        <w:rPr>
-          <w:rFonts w:ascii="Consolas" w:eastAsia="Consolas" w:hAnsi="Consolas" w:cs="Consolas"/>
-          <w:sz w:val="22"/>
-          <w:szCs w:val="22"/>
-        </w:rPr>
-        <w:t>dist</w:t>
-      </w:r>
-      <w:proofErr w:type="spellEnd"/>
-      <w:r>
-        <w:rPr>
-          <w:rFonts w:ascii="Consolas" w:eastAsia="Consolas" w:hAnsi="Consolas" w:cs="Consolas"/>
-          <w:sz w:val="22"/>
-          <w:szCs w:val="22"/>
-        </w:rPr>
-        <w:t xml:space="preserve">/ (Static HTML/JS/CSS </w:t>
-      </w:r>
-      <w:proofErr w:type="gramStart"/>
-      <w:r>
-        <w:rPr>
-          <w:rFonts w:ascii="Consolas" w:eastAsia="Consolas" w:hAnsi="Consolas" w:cs="Consolas"/>
-          <w:sz w:val="22"/>
-          <w:szCs w:val="22"/>
-        </w:rPr>
-        <w:t xml:space="preserve">bundles)   </w:t>
-      </w:r>
-      <w:proofErr w:type="gramEnd"/>
-      <w:r>
-        <w:rPr>
-          <w:rFonts w:ascii="Consolas" w:eastAsia="Consolas" w:hAnsi="Consolas" w:cs="Consolas"/>
-          <w:sz w:val="22"/>
-          <w:szCs w:val="22"/>
-        </w:rPr>
-        <w:t xml:space="preserve">            |</w:t>
-      </w:r>
-    </w:p>
-    <w:p>
-      <w:pPr>
-        <w:spacing w:after="0"/>
-        <w:rPr>
-          <w:sz w:val="22"/>
-          <w:szCs w:val="22"/>
-        </w:rPr>
-      </w:pPr>
-      <w:proofErr w:type="gramStart"/>
-      <w:r>
-        <w:rPr>
-          <w:rFonts w:ascii="Consolas" w:eastAsia="Consolas" w:hAnsi="Consolas" w:cs="Consolas"/>
-          <w:sz w:val="22"/>
-          <w:szCs w:val="22"/>
-        </w:rPr>
-        <w:t>+-</w:t>
-      </w:r>
-      <w:proofErr w:type="gramEnd"/>
-      <w:r>
-        <w:rPr>
-          <w:rFonts w:ascii="Consolas" w:eastAsia="Consolas" w:hAnsi="Consolas" w:cs="Consolas"/>
-          <w:sz w:val="22"/>
-          <w:szCs w:val="22"/>
-        </w:rPr>
-        <w:t>-----------------------------------------------------------------------+</w:t>
-      </w:r>
-    </w:p>
-    <w:p>
-      <w:pPr>
-        <w:spacing w:after="0"/>
-        <w:rPr>
-          <w:sz w:val="22"/>
-          <w:szCs w:val="22"/>
-        </w:rPr>
-      </w:pPr>
-      <w:r>
-        <w:rPr>
-          <w:rFonts w:ascii="Consolas" w:eastAsia="Consolas" w:hAnsi="Consolas" w:cs="Consolas"/>
-          <w:sz w:val="22"/>
-          <w:szCs w:val="22"/>
-        </w:rPr>
-        <w:t xml:space="preserve">                                   </w:t>
-      </w:r>
-      <w:proofErr w:type="gramStart"/>
-      <w:r>
-        <w:rPr>
-          <w:rFonts w:ascii="Consolas" w:eastAsia="Consolas" w:hAnsi="Consolas" w:cs="Consolas"/>
-          <w:sz w:val="22"/>
-          <w:szCs w:val="22"/>
-        </w:rPr>
-        <w:t>│  (</w:t>
-      </w:r>
-      <w:proofErr w:type="gramEnd"/>
-      <w:r>
-        <w:rPr>
-          <w:rFonts w:ascii="Consolas" w:eastAsia="Consolas" w:hAnsi="Consolas" w:cs="Consolas"/>
-          <w:sz w:val="22"/>
-          <w:szCs w:val="22"/>
-        </w:rPr>
-        <w:t>REST API calls)</w:t>
-      </w:r>
-    </w:p>
-    <w:p>
-      <w:pPr>
-        <w:spacing w:after="0"/>
-        <w:rPr>
-          <w:sz w:val="22"/>
-          <w:szCs w:val="22"/>
-        </w:rPr>
-      </w:pPr>
-      <w:r>
-        <w:rPr>
-          <w:rFonts w:ascii="Consolas" w:eastAsia="Consolas" w:hAnsi="Consolas" w:cs="Consolas"/>
-          <w:sz w:val="22"/>
-          <w:szCs w:val="22"/>
-        </w:rPr>
-        <w:t xml:space="preserve">                                   ▼</w:t>
-      </w:r>
-    </w:p>
-    <w:p>
-      <w:pPr>
-        <w:spacing w:after="0"/>
-        <w:rPr>
-          <w:sz w:val="22"/>
-          <w:szCs w:val="22"/>
-        </w:rPr>
-      </w:pPr>
-      <w:proofErr w:type="gramStart"/>
-      <w:r>
-        <w:rPr>
-          <w:rFonts w:ascii="Consolas" w:eastAsia="Consolas" w:hAnsi="Consolas" w:cs="Consolas"/>
-          <w:sz w:val="22"/>
-          <w:szCs w:val="22"/>
-        </w:rPr>
-        <w:t>+-</w:t>
-      </w:r>
-      <w:proofErr w:type="gramEnd"/>
-      <w:r>
-        <w:rPr>
-          <w:rFonts w:ascii="Consolas" w:eastAsia="Consolas" w:hAnsi="Consolas" w:cs="Consolas"/>
-          <w:sz w:val="22"/>
-          <w:szCs w:val="22"/>
-        </w:rPr>
-        <w:t>-----------------------------------------------------------------------+</w:t>
-      </w:r>
-    </w:p>
-    <w:p>
-      <w:pPr>
-        <w:spacing w:after="0"/>
-        <w:rPr>
-          <w:sz w:val="22"/>
-          <w:szCs w:val="22"/>
-        </w:rPr>
-      </w:pPr>
-      <w:r>
-        <w:rPr>
-          <w:rFonts w:ascii="Consolas" w:eastAsia="Consolas" w:hAnsi="Consolas" w:cs="Consolas"/>
-          <w:sz w:val="22"/>
-          <w:szCs w:val="22"/>
-        </w:rPr>
-        <w:t>| Host Server / .NET Runtime                                             |</w:t>
-      </w:r>
-    </w:p>
-    <w:p>
-      <w:pPr>
-        <w:spacing w:after="0"/>
-        <w:rPr>
-          <w:sz w:val="22"/>
-          <w:szCs w:val="22"/>
-        </w:rPr>
-      </w:pPr>
-      <w:proofErr w:type="gramStart"/>
-      <w:r>
-        <w:rPr>
-          <w:rFonts w:ascii="Consolas" w:eastAsia="Consolas" w:hAnsi="Consolas" w:cs="Consolas"/>
-          <w:sz w:val="22"/>
-          <w:szCs w:val="22"/>
-        </w:rPr>
-        <w:t>|  ├</w:t>
-      </w:r>
-      <w:proofErr w:type="gramEnd"/>
-      <w:r>
-        <w:rPr>
-          <w:rFonts w:ascii="Consolas" w:eastAsia="Consolas" w:hAnsi="Consolas" w:cs="Consolas"/>
-          <w:sz w:val="22"/>
-          <w:szCs w:val="22"/>
-        </w:rPr>
-        <w:t>── ExpenseMate.Api.dll                                               |</w:t>
-      </w:r>
-    </w:p>
-    <w:p>
-      <w:pPr>
-        <w:spacing w:after="0"/>
-        <w:rPr>
-          <w:sz w:val="22"/>
-          <w:szCs w:val="22"/>
-        </w:rPr>
-      </w:pPr>
-      <w:proofErr w:type="gramStart"/>
-      <w:r>
-        <w:rPr>
-          <w:rFonts w:ascii="Consolas" w:eastAsia="Consolas" w:hAnsi="Consolas" w:cs="Consolas"/>
-          <w:sz w:val="22"/>
-          <w:szCs w:val="22"/>
-        </w:rPr>
-        <w:t>|  ├</w:t>
-      </w:r>
-      <w:proofErr w:type="gramEnd"/>
-      <w:r>
-        <w:rPr>
-          <w:rFonts w:ascii="Consolas" w:eastAsia="Consolas" w:hAnsi="Consolas" w:cs="Consolas"/>
-          <w:sz w:val="22"/>
-          <w:szCs w:val="22"/>
-        </w:rPr>
-        <w:t>── ExpenseMate.Services.dll                                          |</w:t>
-      </w:r>
-    </w:p>
-    <w:p>
-      <w:pPr>
-        <w:spacing w:after="0"/>
-        <w:rPr>
-          <w:sz w:val="22"/>
-          <w:szCs w:val="22"/>
-        </w:rPr>
-      </w:pPr>
-      <w:proofErr w:type="gramStart"/>
-      <w:r>
-        <w:rPr>
-          <w:rFonts w:ascii="Consolas" w:eastAsia="Consolas" w:hAnsi="Consolas" w:cs="Consolas"/>
-          <w:sz w:val="22"/>
-          <w:szCs w:val="22"/>
-        </w:rPr>
-        <w:t>|  ├</w:t>
-      </w:r>
-      <w:proofErr w:type="gramEnd"/>
-      <w:r>
-        <w:rPr>
-          <w:rFonts w:ascii="Consolas" w:eastAsia="Consolas" w:hAnsi="Consolas" w:cs="Consolas"/>
-          <w:sz w:val="22"/>
-          <w:szCs w:val="22"/>
-        </w:rPr>
-        <w:t>── ExpenseMate.Database.dll                                          |</w:t>
-      </w:r>
-    </w:p>
-    <w:p>
-      <w:pPr>
-        <w:spacing w:after="0"/>
-        <w:rPr>
-          <w:sz w:val="22"/>
-          <w:szCs w:val="22"/>
-        </w:rPr>
-      </w:pPr>
-      <w:proofErr w:type="gramStart"/>
-      <w:r>
-        <w:rPr>
-          <w:rFonts w:ascii="Consolas" w:eastAsia="Consolas" w:hAnsi="Consolas" w:cs="Consolas"/>
-          <w:sz w:val="22"/>
-          <w:szCs w:val="22"/>
-        </w:rPr>
-        <w:t>|  └</w:t>
-      </w:r>
-      <w:proofErr w:type="gramEnd"/>
-      <w:r>
-        <w:rPr>
-          <w:rFonts w:ascii="Consolas" w:eastAsia="Consolas" w:hAnsi="Consolas" w:cs="Consolas"/>
-          <w:sz w:val="22"/>
-          <w:szCs w:val="22"/>
-        </w:rPr>
-        <w:t>── ExpenseMate.Domain.dll                                            |</w:t>
-      </w:r>
-    </w:p>
-    <w:p>
-      <w:pPr>
-        <w:spacing w:after="0"/>
-        <w:rPr>
-          <w:sz w:val="22"/>
-          <w:szCs w:val="22"/>
-        </w:rPr>
-      </w:pPr>
-      <w:proofErr w:type="gramStart"/>
-      <w:r>
-        <w:rPr>
-          <w:rFonts w:ascii="Consolas" w:eastAsia="Consolas" w:hAnsi="Consolas" w:cs="Consolas"/>
-          <w:sz w:val="22"/>
-          <w:szCs w:val="22"/>
-        </w:rPr>
-        <w:t>+-</w:t>
-      </w:r>
-      <w:proofErr w:type="gramEnd"/>
-      <w:r>
-        <w:rPr>
-          <w:rFonts w:ascii="Consolas" w:eastAsia="Consolas" w:hAnsi="Consolas" w:cs="Consolas"/>
-          <w:sz w:val="22"/>
-          <w:szCs w:val="22"/>
-        </w:rPr>
-        <w:t>-----------------------------------------------------------------------+</w:t>
-      </w:r>
-    </w:p>
-    <w:p>
-      <w:pPr>
-        <w:spacing w:after="0"/>
-        <w:rPr>
-          <w:sz w:val="22"/>
-          <w:szCs w:val="22"/>
-        </w:rPr>
-      </w:pPr>
-      <w:r>
-        <w:rPr>
-          <w:rFonts w:ascii="Consolas" w:eastAsia="Consolas" w:hAnsi="Consolas" w:cs="Consolas"/>
-          <w:sz w:val="22"/>
-          <w:szCs w:val="22"/>
-        </w:rPr>
-        <w:t xml:space="preserve">                                   </w:t>
-      </w:r>
-      <w:proofErr w:type="gramStart"/>
-      <w:r>
-        <w:rPr>
-          <w:rFonts w:ascii="Consolas" w:eastAsia="Consolas" w:hAnsi="Consolas" w:cs="Consolas"/>
-          <w:sz w:val="22"/>
-          <w:szCs w:val="22"/>
-        </w:rPr>
-        <w:t>│  (</w:t>
-      </w:r>
-      <w:proofErr w:type="gramEnd"/>
-      <w:r>
-        <w:rPr>
-          <w:rFonts w:ascii="Consolas" w:eastAsia="Consolas" w:hAnsi="Consolas" w:cs="Consolas"/>
-          <w:sz w:val="22"/>
-          <w:szCs w:val="22"/>
-        </w:rPr>
-        <w:t>TDS Protocol / Connection String)</w:t>
-      </w:r>
-    </w:p>
-    <w:p>
-      <w:pPr>
-        <w:spacing w:after="0"/>
-        <w:rPr>
-          <w:sz w:val="22"/>
-          <w:szCs w:val="22"/>
-        </w:rPr>
-      </w:pPr>
-      <w:r>
-        <w:rPr>
-          <w:rFonts w:ascii="Consolas" w:eastAsia="Consolas" w:hAnsi="Consolas" w:cs="Consolas"/>
-          <w:sz w:val="22"/>
-          <w:szCs w:val="22"/>
-        </w:rPr>
-        <w:t xml:space="preserve">                                   ▼</w:t>
-      </w:r>
-    </w:p>
-    <w:p>
-      <w:pPr>
-        <w:spacing w:after="0"/>
-        <w:rPr>
-          <w:sz w:val="22"/>
-          <w:szCs w:val="22"/>
-        </w:rPr>
-      </w:pPr>
-      <w:proofErr w:type="gramStart"/>
-      <w:r>
-        <w:rPr>
-          <w:rFonts w:ascii="Consolas" w:eastAsia="Consolas" w:hAnsi="Consolas" w:cs="Consolas"/>
-          <w:sz w:val="22"/>
-          <w:szCs w:val="22"/>
-        </w:rPr>
-        <w:t>+-</w:t>
-      </w:r>
-      <w:proofErr w:type="gramEnd"/>
-      <w:r>
-        <w:rPr>
-          <w:rFonts w:ascii="Consolas" w:eastAsia="Consolas" w:hAnsi="Consolas" w:cs="Consolas"/>
-          <w:sz w:val="22"/>
-          <w:szCs w:val="22"/>
-        </w:rPr>
-        <w:t>-----------------------------------------------------------------------+</w:t>
-      </w:r>
-    </w:p>
-    <w:p>
-      <w:pPr>
-        <w:spacing w:after="0"/>
-        <w:rPr>
-          <w:sz w:val="22"/>
-          <w:szCs w:val="22"/>
-        </w:rPr>
-      </w:pPr>
-      <w:r>
-        <w:rPr>
-          <w:rFonts w:ascii="Consolas" w:eastAsia="Consolas" w:hAnsi="Consolas" w:cs="Consolas"/>
-          <w:sz w:val="22"/>
-          <w:szCs w:val="22"/>
-        </w:rPr>
-        <w:t>| Database Host / SQL Server Engine                                      |</w:t>
-      </w:r>
-    </w:p>
-    <w:p>
-      <w:pPr>
-        <w:spacing w:after="0"/>
-        <w:rPr>
-          <w:sz w:val="22"/>
-          <w:szCs w:val="22"/>
-        </w:rPr>
-      </w:pPr>
-      <w:proofErr w:type="gramStart"/>
-      <w:r>
-        <w:rPr>
-          <w:rFonts w:ascii="Consolas" w:eastAsia="Consolas" w:hAnsi="Consolas" w:cs="Consolas"/>
-          <w:sz w:val="22"/>
-          <w:szCs w:val="22"/>
-        </w:rPr>
-        <w:t>|  └</w:t>
-      </w:r>
-      <w:proofErr w:type="gramEnd"/>
-      <w:r>
-        <w:rPr>
-          <w:rFonts w:ascii="Consolas" w:eastAsia="Consolas" w:hAnsi="Consolas" w:cs="Consolas"/>
-          <w:sz w:val="22"/>
-          <w:szCs w:val="22"/>
-        </w:rPr>
-        <w:t xml:space="preserve">── </w:t>
-      </w:r>
-      <w:proofErr w:type="spellStart"/>
-      <w:r>
-        <w:rPr>
-          <w:rFonts w:ascii="Consolas" w:eastAsia="Consolas" w:hAnsi="Consolas" w:cs="Consolas"/>
-          <w:sz w:val="22"/>
-          <w:szCs w:val="22"/>
-        </w:rPr>
-        <w:t>ExpenseMate.mdf</w:t>
-      </w:r>
-      <w:proofErr w:type="spellEnd"/>
-      <w:r>
-        <w:rPr>
-          <w:rFonts w:ascii="Consolas" w:eastAsia="Consolas" w:hAnsi="Consolas" w:cs="Consolas"/>
-          <w:sz w:val="22"/>
-          <w:szCs w:val="22"/>
-        </w:rPr>
-        <w:t xml:space="preserve"> (Database </w:t>
-      </w:r>
-      <w:proofErr w:type="gramStart"/>
-      <w:r>
-        <w:rPr>
-          <w:rFonts w:ascii="Consolas" w:eastAsia="Consolas" w:hAnsi="Consolas" w:cs="Consolas"/>
-          <w:sz w:val="22"/>
-          <w:szCs w:val="22"/>
-        </w:rPr>
-        <w:t xml:space="preserve">File)   </w:t>
-      </w:r>
-      <w:proofErr w:type="gramEnd"/>
-      <w:r>
-        <w:rPr>
-          <w:rFonts w:ascii="Consolas" w:eastAsia="Consolas" w:hAnsi="Consolas" w:cs="Consolas"/>
-          <w:sz w:val="22"/>
-          <w:szCs w:val="22"/>
-        </w:rPr>
-        <w:t xml:space="preserve">                                |</w:t>
-      </w:r>
-    </w:p>
-    <w:p>
-      <w:pPr>
-        <w:spacing w:after="0" w:line="240" w:lineRule="auto"/>
-        <w:rPr>
-          <w:sz w:val="22"/>
-          <w:szCs w:val="22"/>
-        </w:rPr>
-      </w:pPr>
-      <w:proofErr w:type="gramStart"/>
-      <w:r>
-        <w:rPr>
-          <w:rFonts w:ascii="Consolas" w:eastAsia="Consolas" w:hAnsi="Consolas" w:cs="Consolas"/>
-          <w:sz w:val="22"/>
-          <w:szCs w:val="22"/>
-        </w:rPr>
-        <w:t>+-</w:t>
-      </w:r>
-      <w:proofErr w:type="gramEnd"/>
-      <w:r>
-        <w:rPr>
-          <w:rFonts w:ascii="Consolas" w:eastAsia="Consolas" w:hAnsi="Consolas" w:cs="Consolas"/>
-          <w:sz w:val="22"/>
-          <w:szCs w:val="22"/>
-        </w:rPr>
-        <w:t>-----------------------------------------------------------------------+</w:t>
-      </w:r>
-    </w:p>
-    <w:p>
-      <w:pPr>
-        <w:spacing w:after="0" w:line="240" w:lineRule="auto"/>
-        <w:rPr>
-          <w:sz w:val="28"/>
-          <w:szCs w:val="28"/>
-        </w:rPr>
-      </w:pPr>
-    </w:p>
-    <w:p>
-      <w:pPr>
-        <w:spacing w:after="0" w:line="240" w:lineRule="auto"/>
-        <w:rPr>
-          <w:sz w:val="28"/>
-          <w:szCs w:val="28"/>
-        </w:rPr>
-      </w:pPr>
-    </w:p>
-    <w:p>
-      <w:pPr>
-        <w:spacing w:after="0" w:line="240" w:lineRule="auto"/>
-        <w:rPr>
-          <w:sz w:val="28"/>
-          <w:szCs w:val="28"/>
-        </w:rPr>
-      </w:pPr>
-    </w:p>
-    <w:p>
-      <w:pPr>
-        <w:spacing w:after="0" w:line="240" w:lineRule="auto"/>
-        <w:rPr>
-          <w:sz w:val="28"/>
-          <w:szCs w:val="28"/>
-        </w:rPr>
-      </w:pPr>
-    </w:p>
-    <w:p>
-      <w:pPr>
-        <w:spacing w:after="0" w:line="240" w:lineRule="auto"/>
-        <w:rPr>
-          <w:sz w:val="28"/>
-          <w:szCs w:val="28"/>
-        </w:rPr>
-      </w:pPr>
-    </w:p>
-    <w:p>
-      <w:pPr>
-        <w:spacing w:after="0" w:line="240" w:lineRule="auto"/>
-        <w:rPr>
-          <w:sz w:val="28"/>
-          <w:szCs w:val="28"/>
-        </w:rPr>
-      </w:pPr>
-    </w:p>
-    <w:p>
-      <w:pPr>
-        <w:spacing w:after="0" w:line="240" w:lineRule="auto"/>
-        <w:rPr>
-          <w:sz w:val="28"/>
-          <w:szCs w:val="28"/>
-        </w:rPr>
-      </w:pPr>
-    </w:p>
-    <w:p>
-      <w:pPr>
-        <w:spacing w:after="0" w:line="240" w:lineRule="auto"/>
-        <w:rPr>
-          <w:sz w:val="28"/>
-          <w:szCs w:val="28"/>
-        </w:rPr>
-      </w:pPr>
-    </w:p>
-    <w:p>
-      <w:pPr>
-        <w:spacing w:after="0" w:line="240" w:lineRule="auto"/>
-        <w:rPr>
-          <w:sz w:val="28"/>
-          <w:szCs w:val="28"/>
-        </w:rPr>
-      </w:pPr>
-    </w:p>
-    <w:p>
-      <w:pPr>
-        <w:spacing w:after="0" w:line="240" w:lineRule="auto"/>
-        <w:rPr>
-          <w:sz w:val="28"/>
-          <w:szCs w:val="28"/>
-        </w:rPr>
-      </w:pPr>
-    </w:p>
-    <w:p>
-      <w:pPr>
-        <w:spacing w:after="0" w:line="240" w:lineRule="auto"/>
-        <w:rPr>
-          <w:sz w:val="28"/>
-          <w:szCs w:val="28"/>
-        </w:rPr>
-      </w:pPr>
-    </w:p>
-    <w:p>
-      <w:pPr>
-        <w:spacing w:after="0" w:line="240" w:lineRule="auto"/>
-        <w:rPr>
-          <w:sz w:val="28"/>
-          <w:szCs w:val="28"/>
-        </w:rPr>
-      </w:pPr>
-    </w:p>
-    <w:p>
-      <w:pPr>
-        <w:spacing w:after="0" w:line="240" w:lineRule="auto"/>
-        <w:rPr>
-          <w:sz w:val="28"/>
-          <w:szCs w:val="28"/>
-        </w:rPr>
-      </w:pPr>
-    </w:p>
-    <w:p>
-      <w:pPr>
-        <w:spacing w:after="0" w:line="240" w:lineRule="auto"/>
-        <w:rPr>
-          <w:sz w:val="28"/>
-          <w:szCs w:val="28"/>
-        </w:rPr>
-      </w:pPr>
-    </w:p>
-    <w:p>
-      <w:pPr>
-        <w:spacing w:after="0" w:line="240" w:lineRule="auto"/>
-        <w:rPr>
-          <w:sz w:val="28"/>
-          <w:szCs w:val="28"/>
-        </w:rPr>
-      </w:pPr>
-    </w:p>
-    <w:p>
-      <w:pPr>
-        <w:spacing w:after="0" w:line="240" w:lineRule="auto"/>
-        <w:rPr>
-          <w:sz w:val="28"/>
-          <w:szCs w:val="28"/>
-        </w:rPr>
-      </w:pPr>
-    </w:p>
-    <w:p>
-      <w:pPr>
-        <w:spacing w:after="0" w:line="240" w:lineRule="auto"/>
-        <w:rPr>
-          <w:sz w:val="28"/>
-          <w:szCs w:val="28"/>
-        </w:rPr>
-      </w:pPr>
-    </w:p>
-    <w:p>
-      <w:pPr>
-        <w:spacing w:after="0" w:line="240" w:lineRule="auto"/>
-        <w:jc w:val="center"/>
-        <w:rPr>
+          <w:rFonts w:ascii="Abadi" w:hAnsi="Abadi"/>
           <w:b/>
           <w:bCs/>
+          <w:sz w:val="28"/>
+          <w:szCs w:val="28"/>
+        </w:rPr>
+      </w:pPr>
+    </w:p>
+    <w:p>
+      <w:pPr>
+        <w:spacing w:after="0" w:line="240" w:lineRule="auto"/>
+        <w:rPr>
+          <w:sz w:val="28"/>
+          <w:szCs w:val="28"/>
+        </w:rPr>
+      </w:pPr>
+      <w:r>
+        <w:rPr>
+          <w:sz w:val="28"/>
+          <w:szCs w:val="28"/>
+        </w:rPr>
+        <w:t xml:space="preserve">Defines how source code artifacts compile and deploy onto host nodes: </w:t>
+      </w:r>
+    </w:p>
+    <w:p>
+      <w:pPr>
+        <w:spacing w:after="0"/>
+        <w:rPr>
+          <w:sz w:val="22"/>
+          <w:szCs w:val="22"/>
+        </w:rPr>
+      </w:pPr>
+      <w:r>
+        <w:rPr>
+          <w:sz w:val="22"/>
+          <w:szCs w:val="22"/>
+        </w:rPr>
+        <w:br/>
+      </w:r>
+      <w:proofErr w:type="gramStart"/>
+      <w:r>
+        <w:rPr>
+          <w:rFonts w:ascii="Consolas" w:eastAsia="Consolas" w:hAnsi="Consolas" w:cs="Consolas"/>
+          <w:sz w:val="22"/>
+          <w:szCs w:val="22"/>
+        </w:rPr>
+        <w:t>+-</w:t>
+      </w:r>
+      <w:proofErr w:type="gramEnd"/>
+      <w:r>
+        <w:rPr>
+          <w:rFonts w:ascii="Consolas" w:eastAsia="Consolas" w:hAnsi="Consolas" w:cs="Consolas"/>
+          <w:sz w:val="22"/>
+          <w:szCs w:val="22"/>
+        </w:rPr>
+        <w:t>-----------------------------------------------------------------------+</w:t>
+      </w:r>
+    </w:p>
+    <w:p>
+      <w:pPr>
+        <w:spacing w:after="0"/>
+        <w:rPr>
+          <w:sz w:val="22"/>
+          <w:szCs w:val="22"/>
+        </w:rPr>
+      </w:pPr>
+      <w:r>
+        <w:rPr>
+          <w:rFonts w:ascii="Consolas" w:eastAsia="Consolas" w:hAnsi="Consolas" w:cs="Consolas"/>
+          <w:sz w:val="22"/>
+          <w:szCs w:val="22"/>
+        </w:rPr>
+        <w:t>| Client Machine / Node Runtime                                          |</w:t>
+      </w:r>
+    </w:p>
+    <w:p>
+      <w:pPr>
+        <w:spacing w:after="0"/>
+        <w:rPr>
+          <w:sz w:val="22"/>
+          <w:szCs w:val="22"/>
+        </w:rPr>
+      </w:pPr>
+      <w:proofErr w:type="gramStart"/>
+      <w:r>
+        <w:rPr>
+          <w:rFonts w:ascii="Consolas" w:eastAsia="Consolas" w:hAnsi="Consolas" w:cs="Consolas"/>
+          <w:sz w:val="22"/>
+          <w:szCs w:val="22"/>
+        </w:rPr>
+        <w:t>|  └</w:t>
+      </w:r>
+      <w:proofErr w:type="gramEnd"/>
+      <w:r>
+        <w:rPr>
+          <w:rFonts w:ascii="Consolas" w:eastAsia="Consolas" w:hAnsi="Consolas" w:cs="Consolas"/>
+          <w:sz w:val="22"/>
+          <w:szCs w:val="22"/>
+        </w:rPr>
+        <w:t>── /expense-mate-</w:t>
+      </w:r>
+      <w:proofErr w:type="spellStart"/>
+      <w:r>
+        <w:rPr>
+          <w:rFonts w:ascii="Consolas" w:eastAsia="Consolas" w:hAnsi="Consolas" w:cs="Consolas"/>
+          <w:sz w:val="22"/>
+          <w:szCs w:val="22"/>
+        </w:rPr>
+        <w:t>ui</w:t>
+      </w:r>
+      <w:proofErr w:type="spellEnd"/>
+      <w:r>
+        <w:rPr>
+          <w:rFonts w:ascii="Consolas" w:eastAsia="Consolas" w:hAnsi="Consolas" w:cs="Consolas"/>
+          <w:sz w:val="22"/>
+          <w:szCs w:val="22"/>
+        </w:rPr>
+        <w:t>/</w:t>
+      </w:r>
+      <w:proofErr w:type="spellStart"/>
+      <w:r>
+        <w:rPr>
+          <w:rFonts w:ascii="Consolas" w:eastAsia="Consolas" w:hAnsi="Consolas" w:cs="Consolas"/>
+          <w:sz w:val="22"/>
+          <w:szCs w:val="22"/>
+        </w:rPr>
+        <w:t>dist</w:t>
+      </w:r>
+      <w:proofErr w:type="spellEnd"/>
+      <w:r>
+        <w:rPr>
+          <w:rFonts w:ascii="Consolas" w:eastAsia="Consolas" w:hAnsi="Consolas" w:cs="Consolas"/>
+          <w:sz w:val="22"/>
+          <w:szCs w:val="22"/>
+        </w:rPr>
+        <w:t xml:space="preserve">/ (Static HTML/JS/CSS </w:t>
+      </w:r>
+      <w:proofErr w:type="gramStart"/>
+      <w:r>
+        <w:rPr>
+          <w:rFonts w:ascii="Consolas" w:eastAsia="Consolas" w:hAnsi="Consolas" w:cs="Consolas"/>
+          <w:sz w:val="22"/>
+          <w:szCs w:val="22"/>
+        </w:rPr>
+        <w:t xml:space="preserve">bundles)   </w:t>
+      </w:r>
+      <w:proofErr w:type="gramEnd"/>
+      <w:r>
+        <w:rPr>
+          <w:rFonts w:ascii="Consolas" w:eastAsia="Consolas" w:hAnsi="Consolas" w:cs="Consolas"/>
+          <w:sz w:val="22"/>
+          <w:szCs w:val="22"/>
+        </w:rPr>
+        <w:t xml:space="preserve">            |</w:t>
+      </w:r>
+    </w:p>
+    <w:p>
+      <w:pPr>
+        <w:spacing w:after="0"/>
+        <w:rPr>
+          <w:sz w:val="22"/>
+          <w:szCs w:val="22"/>
+        </w:rPr>
+      </w:pPr>
+      <w:proofErr w:type="gramStart"/>
+      <w:r>
+        <w:rPr>
+          <w:rFonts w:ascii="Consolas" w:eastAsia="Consolas" w:hAnsi="Consolas" w:cs="Consolas"/>
+          <w:sz w:val="22"/>
+          <w:szCs w:val="22"/>
+        </w:rPr>
+        <w:t>+-</w:t>
+      </w:r>
+      <w:proofErr w:type="gramEnd"/>
+      <w:r>
+        <w:rPr>
+          <w:rFonts w:ascii="Consolas" w:eastAsia="Consolas" w:hAnsi="Consolas" w:cs="Consolas"/>
+          <w:sz w:val="22"/>
+          <w:szCs w:val="22"/>
+        </w:rPr>
+        <w:t>-----------------------------------------------------------------------+</w:t>
+      </w:r>
+    </w:p>
+    <w:p>
+      <w:pPr>
+        <w:spacing w:after="0"/>
+        <w:rPr>
+          <w:sz w:val="22"/>
+          <w:szCs w:val="22"/>
+        </w:rPr>
+      </w:pPr>
+      <w:r>
+        <w:rPr>
+          <w:rFonts w:ascii="Consolas" w:eastAsia="Consolas" w:hAnsi="Consolas" w:cs="Consolas"/>
+          <w:sz w:val="22"/>
+          <w:szCs w:val="22"/>
+        </w:rPr>
+        <w:t xml:space="preserve">                                   </w:t>
+      </w:r>
+      <w:proofErr w:type="gramStart"/>
+      <w:r>
+        <w:rPr>
+          <w:rFonts w:ascii="Consolas" w:eastAsia="Consolas" w:hAnsi="Consolas" w:cs="Consolas"/>
+          <w:sz w:val="22"/>
+          <w:szCs w:val="22"/>
+        </w:rPr>
+        <w:t>│  (</w:t>
+      </w:r>
+      <w:proofErr w:type="gramEnd"/>
+      <w:r>
+        <w:rPr>
+          <w:rFonts w:ascii="Consolas" w:eastAsia="Consolas" w:hAnsi="Consolas" w:cs="Consolas"/>
+          <w:sz w:val="22"/>
+          <w:szCs w:val="22"/>
+        </w:rPr>
+        <w:t>REST API calls)</w:t>
+      </w:r>
+    </w:p>
+    <w:p>
+      <w:pPr>
+        <w:spacing w:after="0"/>
+        <w:rPr>
+          <w:sz w:val="22"/>
+          <w:szCs w:val="22"/>
+        </w:rPr>
+      </w:pPr>
+      <w:r>
+        <w:rPr>
+          <w:rFonts w:ascii="Consolas" w:eastAsia="Consolas" w:hAnsi="Consolas" w:cs="Consolas"/>
+          <w:sz w:val="22"/>
+          <w:szCs w:val="22"/>
+        </w:rPr>
+        <w:t xml:space="preserve">                                   ▼</w:t>
+      </w:r>
+    </w:p>
+    <w:p>
+      <w:pPr>
+        <w:spacing w:after="0"/>
+        <w:rPr>
+          <w:sz w:val="22"/>
+          <w:szCs w:val="22"/>
+        </w:rPr>
+      </w:pPr>
+      <w:proofErr w:type="gramStart"/>
+      <w:r>
+        <w:rPr>
+          <w:rFonts w:ascii="Consolas" w:eastAsia="Consolas" w:hAnsi="Consolas" w:cs="Consolas"/>
+          <w:sz w:val="22"/>
+          <w:szCs w:val="22"/>
+        </w:rPr>
+        <w:t>+-</w:t>
+      </w:r>
+      <w:proofErr w:type="gramEnd"/>
+      <w:r>
+        <w:rPr>
+          <w:rFonts w:ascii="Consolas" w:eastAsia="Consolas" w:hAnsi="Consolas" w:cs="Consolas"/>
+          <w:sz w:val="22"/>
+          <w:szCs w:val="22"/>
+        </w:rPr>
+        <w:t>-----------------------------------------------------------------------+</w:t>
+      </w:r>
+    </w:p>
+    <w:p>
+      <w:pPr>
+        <w:spacing w:after="0"/>
+        <w:rPr>
+          <w:sz w:val="22"/>
+          <w:szCs w:val="22"/>
+        </w:rPr>
+      </w:pPr>
+      <w:r>
+        <w:rPr>
+          <w:rFonts w:ascii="Consolas" w:eastAsia="Consolas" w:hAnsi="Consolas" w:cs="Consolas"/>
+          <w:sz w:val="22"/>
+          <w:szCs w:val="22"/>
+        </w:rPr>
+        <w:t>| Host Server / .NET Runtime                                             |</w:t>
+      </w:r>
+    </w:p>
+    <w:p>
+      <w:pPr>
+        <w:spacing w:after="0"/>
+        <w:rPr>
+          <w:sz w:val="22"/>
+          <w:szCs w:val="22"/>
+        </w:rPr>
+      </w:pPr>
+      <w:proofErr w:type="gramStart"/>
+      <w:r>
+        <w:rPr>
+          <w:rFonts w:ascii="Consolas" w:eastAsia="Consolas" w:hAnsi="Consolas" w:cs="Consolas"/>
+          <w:sz w:val="22"/>
+          <w:szCs w:val="22"/>
+        </w:rPr>
+        <w:t>|  ├</w:t>
+      </w:r>
+      <w:proofErr w:type="gramEnd"/>
+      <w:r>
+        <w:rPr>
+          <w:rFonts w:ascii="Consolas" w:eastAsia="Consolas" w:hAnsi="Consolas" w:cs="Consolas"/>
+          <w:sz w:val="22"/>
+          <w:szCs w:val="22"/>
+        </w:rPr>
+        <w:t>── ExpenseMate.Api.dll                                               |</w:t>
+      </w:r>
+    </w:p>
+    <w:p>
+      <w:pPr>
+        <w:spacing w:after="0"/>
+        <w:rPr>
+          <w:sz w:val="22"/>
+          <w:szCs w:val="22"/>
+        </w:rPr>
+      </w:pPr>
+      <w:proofErr w:type="gramStart"/>
+      <w:r>
+        <w:rPr>
+          <w:rFonts w:ascii="Consolas" w:eastAsia="Consolas" w:hAnsi="Consolas" w:cs="Consolas"/>
+          <w:sz w:val="22"/>
+          <w:szCs w:val="22"/>
+        </w:rPr>
+        <w:t>|  ├</w:t>
+      </w:r>
+      <w:proofErr w:type="gramEnd"/>
+      <w:r>
+        <w:rPr>
+          <w:rFonts w:ascii="Consolas" w:eastAsia="Consolas" w:hAnsi="Consolas" w:cs="Consolas"/>
+          <w:sz w:val="22"/>
+          <w:szCs w:val="22"/>
+        </w:rPr>
+        <w:t>── ExpenseMate.Services.dll                                          |</w:t>
+      </w:r>
+    </w:p>
+    <w:p>
+      <w:pPr>
+        <w:spacing w:after="0"/>
+        <w:rPr>
+          <w:sz w:val="22"/>
+          <w:szCs w:val="22"/>
+        </w:rPr>
+      </w:pPr>
+      <w:proofErr w:type="gramStart"/>
+      <w:r>
+        <w:rPr>
+          <w:rFonts w:ascii="Consolas" w:eastAsia="Consolas" w:hAnsi="Consolas" w:cs="Consolas"/>
+          <w:sz w:val="22"/>
+          <w:szCs w:val="22"/>
+        </w:rPr>
+        <w:t>|  ├</w:t>
+      </w:r>
+      <w:proofErr w:type="gramEnd"/>
+      <w:r>
+        <w:rPr>
+          <w:rFonts w:ascii="Consolas" w:eastAsia="Consolas" w:hAnsi="Consolas" w:cs="Consolas"/>
+          <w:sz w:val="22"/>
+          <w:szCs w:val="22"/>
+        </w:rPr>
+        <w:t>── ExpenseMate.Database.dll                                          |</w:t>
+      </w:r>
+    </w:p>
+    <w:p>
+      <w:pPr>
+        <w:spacing w:after="0"/>
+        <w:rPr>
+          <w:sz w:val="22"/>
+          <w:szCs w:val="22"/>
+        </w:rPr>
+      </w:pPr>
+      <w:proofErr w:type="gramStart"/>
+      <w:r>
+        <w:rPr>
+          <w:rFonts w:ascii="Consolas" w:eastAsia="Consolas" w:hAnsi="Consolas" w:cs="Consolas"/>
+          <w:sz w:val="22"/>
+          <w:szCs w:val="22"/>
+        </w:rPr>
+        <w:t>|  └</w:t>
+      </w:r>
+      <w:proofErr w:type="gramEnd"/>
+      <w:r>
+        <w:rPr>
+          <w:rFonts w:ascii="Consolas" w:eastAsia="Consolas" w:hAnsi="Consolas" w:cs="Consolas"/>
+          <w:sz w:val="22"/>
+          <w:szCs w:val="22"/>
+        </w:rPr>
+        <w:t>── ExpenseMate.Domain.dll                                            |</w:t>
+      </w:r>
+    </w:p>
+    <w:p>
+      <w:pPr>
+        <w:spacing w:after="0"/>
+        <w:rPr>
+          <w:sz w:val="22"/>
+          <w:szCs w:val="22"/>
+        </w:rPr>
+      </w:pPr>
+      <w:proofErr w:type="gramStart"/>
+      <w:r>
+        <w:rPr>
+          <w:rFonts w:ascii="Consolas" w:eastAsia="Consolas" w:hAnsi="Consolas" w:cs="Consolas"/>
+          <w:sz w:val="22"/>
+          <w:szCs w:val="22"/>
+        </w:rPr>
+        <w:t>+-</w:t>
+      </w:r>
+      <w:proofErr w:type="gramEnd"/>
+      <w:r>
+        <w:rPr>
+          <w:rFonts w:ascii="Consolas" w:eastAsia="Consolas" w:hAnsi="Consolas" w:cs="Consolas"/>
+          <w:sz w:val="22"/>
+          <w:szCs w:val="22"/>
+        </w:rPr>
+        <w:t>-----------------------------------------------------------------------+</w:t>
+      </w:r>
+    </w:p>
+    <w:p>
+      <w:pPr>
+        <w:spacing w:after="0"/>
+        <w:rPr>
+          <w:sz w:val="22"/>
+          <w:szCs w:val="22"/>
+        </w:rPr>
+      </w:pPr>
+      <w:r>
+        <w:rPr>
+          <w:rFonts w:ascii="Consolas" w:eastAsia="Consolas" w:hAnsi="Consolas" w:cs="Consolas"/>
+          <w:sz w:val="22"/>
+          <w:szCs w:val="22"/>
+        </w:rPr>
+        <w:t xml:space="preserve">                                   </w:t>
+      </w:r>
+      <w:proofErr w:type="gramStart"/>
+      <w:r>
+        <w:rPr>
+          <w:rFonts w:ascii="Consolas" w:eastAsia="Consolas" w:hAnsi="Consolas" w:cs="Consolas"/>
+          <w:sz w:val="22"/>
+          <w:szCs w:val="22"/>
+        </w:rPr>
+        <w:t>│  (</w:t>
+      </w:r>
+      <w:proofErr w:type="gramEnd"/>
+      <w:r>
+        <w:rPr>
+          <w:rFonts w:ascii="Consolas" w:eastAsia="Consolas" w:hAnsi="Consolas" w:cs="Consolas"/>
+          <w:sz w:val="22"/>
+          <w:szCs w:val="22"/>
+        </w:rPr>
+        <w:t>TDS Protocol / Connection String)</w:t>
+      </w:r>
+    </w:p>
+    <w:p>
+      <w:pPr>
+        <w:spacing w:after="0"/>
+        <w:rPr>
+          <w:sz w:val="22"/>
+          <w:szCs w:val="22"/>
+        </w:rPr>
+      </w:pPr>
+      <w:r>
+        <w:rPr>
+          <w:rFonts w:ascii="Consolas" w:eastAsia="Consolas" w:hAnsi="Consolas" w:cs="Consolas"/>
+          <w:sz w:val="22"/>
+          <w:szCs w:val="22"/>
+        </w:rPr>
+        <w:t xml:space="preserve">                                   ▼</w:t>
+      </w:r>
+    </w:p>
+    <w:p>
+      <w:pPr>
+        <w:spacing w:after="0"/>
+        <w:rPr>
+          <w:sz w:val="22"/>
+          <w:szCs w:val="22"/>
+        </w:rPr>
+      </w:pPr>
+      <w:proofErr w:type="gramStart"/>
+      <w:r>
+        <w:rPr>
+          <w:rFonts w:ascii="Consolas" w:eastAsia="Consolas" w:hAnsi="Consolas" w:cs="Consolas"/>
+          <w:sz w:val="22"/>
+          <w:szCs w:val="22"/>
+        </w:rPr>
+        <w:t>+-</w:t>
+      </w:r>
+      <w:proofErr w:type="gramEnd"/>
+      <w:r>
+        <w:rPr>
+          <w:rFonts w:ascii="Consolas" w:eastAsia="Consolas" w:hAnsi="Consolas" w:cs="Consolas"/>
+          <w:sz w:val="22"/>
+          <w:szCs w:val="22"/>
+        </w:rPr>
+        <w:t>-----------------------------------------------------------------------+</w:t>
+      </w:r>
+    </w:p>
+    <w:p>
+      <w:pPr>
+        <w:spacing w:after="0"/>
+        <w:rPr>
+          <w:sz w:val="22"/>
+          <w:szCs w:val="22"/>
+        </w:rPr>
+      </w:pPr>
+      <w:r>
+        <w:rPr>
+          <w:rFonts w:ascii="Consolas" w:eastAsia="Consolas" w:hAnsi="Consolas" w:cs="Consolas"/>
+          <w:sz w:val="22"/>
+          <w:szCs w:val="22"/>
+        </w:rPr>
+        <w:t>| Database Host / SQL Server Engine                                      |</w:t>
+      </w:r>
+    </w:p>
+    <w:p>
+      <w:pPr>
+        <w:spacing w:after="0"/>
+        <w:rPr>
+          <w:sz w:val="22"/>
+          <w:szCs w:val="22"/>
+        </w:rPr>
+      </w:pPr>
+      <w:proofErr w:type="gramStart"/>
+      <w:r>
+        <w:rPr>
+          <w:rFonts w:ascii="Consolas" w:eastAsia="Consolas" w:hAnsi="Consolas" w:cs="Consolas"/>
+          <w:sz w:val="22"/>
+          <w:szCs w:val="22"/>
+        </w:rPr>
+        <w:t>|  └</w:t>
+      </w:r>
+      <w:proofErr w:type="gramEnd"/>
+      <w:r>
+        <w:rPr>
+          <w:rFonts w:ascii="Consolas" w:eastAsia="Consolas" w:hAnsi="Consolas" w:cs="Consolas"/>
+          <w:sz w:val="22"/>
+          <w:szCs w:val="22"/>
+        </w:rPr>
+        <w:t xml:space="preserve">── </w:t>
+      </w:r>
+      <w:proofErr w:type="spellStart"/>
+      <w:r>
+        <w:rPr>
+          <w:rFonts w:ascii="Consolas" w:eastAsia="Consolas" w:hAnsi="Consolas" w:cs="Consolas"/>
+          <w:sz w:val="22"/>
+          <w:szCs w:val="22"/>
+        </w:rPr>
+        <w:t>ExpenseMate.mdf</w:t>
+      </w:r>
+      <w:proofErr w:type="spellEnd"/>
+      <w:r>
+        <w:rPr>
+          <w:rFonts w:ascii="Consolas" w:eastAsia="Consolas" w:hAnsi="Consolas" w:cs="Consolas"/>
+          <w:sz w:val="22"/>
+          <w:szCs w:val="22"/>
+        </w:rPr>
+        <w:t xml:space="preserve"> (Database </w:t>
+      </w:r>
+      <w:proofErr w:type="gramStart"/>
+      <w:r>
+        <w:rPr>
+          <w:rFonts w:ascii="Consolas" w:eastAsia="Consolas" w:hAnsi="Consolas" w:cs="Consolas"/>
+          <w:sz w:val="22"/>
+          <w:szCs w:val="22"/>
+        </w:rPr>
+        <w:t xml:space="preserve">File)   </w:t>
+      </w:r>
+      <w:proofErr w:type="gramEnd"/>
+      <w:r>
+        <w:rPr>
+          <w:rFonts w:ascii="Consolas" w:eastAsia="Consolas" w:hAnsi="Consolas" w:cs="Consolas"/>
+          <w:sz w:val="22"/>
+          <w:szCs w:val="22"/>
+        </w:rPr>
+        <w:t xml:space="preserve">                                |</w:t>
+      </w:r>
+    </w:p>
+    <w:p>
+      <w:pPr>
+        <w:spacing w:after="0" w:line="240" w:lineRule="auto"/>
+        <w:rPr>
+          <w:sz w:val="22"/>
+          <w:szCs w:val="22"/>
+        </w:rPr>
+      </w:pPr>
+      <w:proofErr w:type="gramStart"/>
+      <w:r>
+        <w:rPr>
+          <w:rFonts w:ascii="Consolas" w:eastAsia="Consolas" w:hAnsi="Consolas" w:cs="Consolas"/>
+          <w:sz w:val="22"/>
+          <w:szCs w:val="22"/>
+        </w:rPr>
+        <w:t>+-</w:t>
+      </w:r>
+      <w:proofErr w:type="gramEnd"/>
+      <w:r>
+        <w:rPr>
+          <w:rFonts w:ascii="Consolas" w:eastAsia="Consolas" w:hAnsi="Consolas" w:cs="Consolas"/>
+          <w:sz w:val="22"/>
+          <w:szCs w:val="22"/>
+        </w:rPr>
+        <w:t>-----------------------------------------------------------------------+</w:t>
+      </w:r>
+    </w:p>
+    <w:p>
+      <w:pPr>
+        <w:spacing w:after="0" w:line="240" w:lineRule="auto"/>
+        <w:rPr>
+          <w:sz w:val="28"/>
+          <w:szCs w:val="28"/>
+        </w:rPr>
+      </w:pPr>
+    </w:p>
+    <w:p>
+      <w:pPr>
+        <w:spacing w:after="0" w:line="240" w:lineRule="auto"/>
+        <w:rPr>
+          <w:sz w:val="28"/>
+          <w:szCs w:val="28"/>
+        </w:rPr>
+      </w:pPr>
+    </w:p>
+    <w:p>
+      <w:pPr>
+        <w:spacing w:after="0" w:line="240" w:lineRule="auto"/>
+        <w:rPr>
+          <w:sz w:val="28"/>
+          <w:szCs w:val="28"/>
+        </w:rPr>
+      </w:pPr>
+    </w:p>
+    <w:p>
+      <w:pPr>
+        <w:spacing w:after="0" w:line="240" w:lineRule="auto"/>
+        <w:rPr>
+          <w:sz w:val="28"/>
+          <w:szCs w:val="28"/>
+        </w:rPr>
+      </w:pPr>
+    </w:p>
+    <w:p>
+      <w:pPr>
+        <w:spacing w:after="0" w:line="240" w:lineRule="auto"/>
+        <w:rPr>
+          <w:sz w:val="28"/>
+          <w:szCs w:val="28"/>
+        </w:rPr>
+      </w:pPr>
+    </w:p>
+    <w:p>
+      <w:pPr>
+        <w:spacing w:after="0" w:line="240" w:lineRule="auto"/>
+        <w:rPr>
+          <w:sz w:val="28"/>
+          <w:szCs w:val="28"/>
+        </w:rPr>
+      </w:pPr>
+    </w:p>
+    <w:p>
+      <w:pPr>
+        <w:spacing w:after="0" w:line="240" w:lineRule="auto"/>
+        <w:rPr>
+          <w:sz w:val="28"/>
+          <w:szCs w:val="28"/>
+        </w:rPr>
+      </w:pPr>
+    </w:p>
+    <w:p>
+      <w:pPr>
+        <w:spacing w:after="0" w:line="240" w:lineRule="auto"/>
+        <w:rPr>
+          <w:sz w:val="28"/>
+          <w:szCs w:val="28"/>
+        </w:rPr>
+      </w:pPr>
+    </w:p>
+    <w:p>
+      <w:pPr>
+        <w:spacing w:after="0" w:line="240" w:lineRule="auto"/>
+        <w:rPr>
+          <w:sz w:val="28"/>
+          <w:szCs w:val="28"/>
+        </w:rPr>
+      </w:pPr>
+    </w:p>
+    <w:p>
+      <w:pPr>
+        <w:spacing w:after="0" w:line="240" w:lineRule="auto"/>
+        <w:rPr>
+          <w:sz w:val="28"/>
+          <w:szCs w:val="28"/>
+        </w:rPr>
+      </w:pPr>
+    </w:p>
+    <w:p>
+      <w:pPr>
+        <w:spacing w:after="0" w:line="240" w:lineRule="auto"/>
+        <w:rPr>
+          <w:sz w:val="28"/>
+          <w:szCs w:val="28"/>
+        </w:rPr>
+      </w:pPr>
+    </w:p>
+    <w:p>
+      <w:pPr>
+        <w:spacing w:after="0" w:line="240" w:lineRule="auto"/>
+        <w:rPr>
+          <w:sz w:val="28"/>
+          <w:szCs w:val="28"/>
+        </w:rPr>
+      </w:pPr>
+    </w:p>
+    <w:p>
+      <w:pPr>
+        <w:spacing w:after="0" w:line="240" w:lineRule="auto"/>
+        <w:rPr>
+          <w:sz w:val="28"/>
+          <w:szCs w:val="28"/>
+        </w:rPr>
+      </w:pPr>
+    </w:p>
+    <w:p>
+      <w:pPr>
+        <w:spacing w:after="0" w:line="240" w:lineRule="auto"/>
+        <w:rPr>
+          <w:sz w:val="28"/>
+          <w:szCs w:val="28"/>
+        </w:rPr>
+      </w:pPr>
+    </w:p>
+    <w:p>
+      <w:pPr>
+        <w:spacing w:after="0" w:line="240" w:lineRule="auto"/>
+        <w:rPr>
+          <w:sz w:val="28"/>
+          <w:szCs w:val="28"/>
+        </w:rPr>
+      </w:pPr>
+    </w:p>
+    <w:p>
+      <w:pPr>
+        <w:spacing w:after="0" w:line="240" w:lineRule="auto"/>
+        <w:rPr>
+          <w:sz w:val="28"/>
+          <w:szCs w:val="28"/>
+        </w:rPr>
+      </w:pPr>
+    </w:p>
+    <w:p>
+      <w:pPr>
+        <w:spacing w:after="0" w:line="240" w:lineRule="auto"/>
+        <w:rPr>
+          <w:sz w:val="28"/>
+          <w:szCs w:val="28"/>
+        </w:rPr>
+      </w:pPr>
+    </w:p>
+    <w:p>
+      <w:pPr>
+        <w:spacing w:after="0" w:line="240" w:lineRule="auto"/>
+        <w:jc w:val="center"/>
+        <w:rPr>
+          <w:rFonts w:ascii="Abadi" w:hAnsi="Abadi"/>
           <w:sz w:val="32"/>
           <w:szCs w:val="32"/>
         </w:rPr>
       </w:pPr>
       <w:r>
         <w:rPr>
-          <w:b/>
-          <w:bCs/>
+          <w:rFonts w:ascii="Abadi" w:hAnsi="Abadi"/>
           <w:sz w:val="32"/>
           <w:szCs w:val="32"/>
         </w:rPr>
@@ -3321,16 +3378,14 @@
         <w:spacing w:after="0" w:line="240" w:lineRule="auto"/>
         <w:jc w:val="center"/>
         <w:rPr>
-          <w:b/>
-          <w:bCs/>
+          <w:rFonts w:ascii="Abadi" w:hAnsi="Abadi"/>
           <w:sz w:val="32"/>
           <w:szCs w:val="32"/>
         </w:rPr>
       </w:pPr>
       <w:r>
         <w:rPr>
-          <w:b/>
-          <w:bCs/>
+          <w:rFonts w:ascii="Abadi" w:hAnsi="Abadi"/>
           <w:sz w:val="32"/>
           <w:szCs w:val="32"/>
         </w:rPr>
@@ -3655,12 +3710,6 @@
         <w:gridCol w:w="1403"/>
       </w:tblGrid>
       <w:tr>
-        <w:tblPrEx>
-          <w:tblCellMar>
-            <w:top w:w="0" w:type="dxa"/>
-            <w:bottom w:w="0" w:type="dxa"/>
-          </w:tblCellMar>
-        </w:tblPrEx>
         <w:trPr>
           <w:tblHeader/>
         </w:trPr>
@@ -3826,12 +3875,6 @@
         </w:tc>
       </w:tr>
       <w:tr>
-        <w:tblPrEx>
-          <w:tblCellMar>
-            <w:top w:w="0" w:type="dxa"/>
-            <w:bottom w:w="0" w:type="dxa"/>
-          </w:tblCellMar>
-        </w:tblPrEx>
         <w:tc>
           <w:tcPr>
             <w:tcW w:w="2000" w:type="pct"/>
@@ -3945,12 +3988,6 @@
         </w:tc>
       </w:tr>
       <w:tr>
-        <w:tblPrEx>
-          <w:tblCellMar>
-            <w:top w:w="0" w:type="dxa"/>
-            <w:bottom w:w="0" w:type="dxa"/>
-          </w:tblCellMar>
-        </w:tblPrEx>
         <w:tc>
           <w:tcPr>
             <w:tcW w:w="2000" w:type="pct"/>
@@ -4064,12 +4101,6 @@
         </w:tc>
       </w:tr>
       <w:tr>
-        <w:tblPrEx>
-          <w:tblCellMar>
-            <w:top w:w="0" w:type="dxa"/>
-            <w:bottom w:w="0" w:type="dxa"/>
-          </w:tblCellMar>
-        </w:tblPrEx>
         <w:tc>
           <w:tcPr>
             <w:tcW w:w="2000" w:type="pct"/>
@@ -4183,12 +4214,6 @@
         </w:tc>
       </w:tr>
       <w:tr>
-        <w:tblPrEx>
-          <w:tblCellMar>
-            <w:top w:w="0" w:type="dxa"/>
-            <w:bottom w:w="0" w:type="dxa"/>
-          </w:tblCellMar>
-        </w:tblPrEx>
         <w:tc>
           <w:tcPr>
             <w:tcW w:w="2000" w:type="pct"/>
@@ -4302,12 +4327,6 @@
         </w:tc>
       </w:tr>
       <w:tr>
-        <w:tblPrEx>
-          <w:tblCellMar>
-            <w:top w:w="0" w:type="dxa"/>
-            <w:bottom w:w="0" w:type="dxa"/>
-          </w:tblCellMar>
-        </w:tblPrEx>
         <w:tc>
           <w:tcPr>
             <w:tcW w:w="2000" w:type="pct"/>
@@ -4421,12 +4440,6 @@
         </w:tc>
       </w:tr>
       <w:tr>
-        <w:tblPrEx>
-          <w:tblCellMar>
-            <w:top w:w="0" w:type="dxa"/>
-            <w:bottom w:w="0" w:type="dxa"/>
-          </w:tblCellMar>
-        </w:tblPrEx>
         <w:tc>
           <w:tcPr>
             <w:tcW w:w="2000" w:type="pct"/>
@@ -4540,12 +4553,6 @@
         </w:tc>
       </w:tr>
       <w:tr>
-        <w:tblPrEx>
-          <w:tblCellMar>
-            <w:top w:w="0" w:type="dxa"/>
-            <w:bottom w:w="0" w:type="dxa"/>
-          </w:tblCellMar>
-        </w:tblPrEx>
         <w:tc>
           <w:tcPr>
             <w:tcW w:w="2000" w:type="pct"/>
@@ -4659,12 +4666,6 @@
         </w:tc>
       </w:tr>
       <w:tr>
-        <w:tblPrEx>
-          <w:tblCellMar>
-            <w:top w:w="0" w:type="dxa"/>
-            <w:bottom w:w="0" w:type="dxa"/>
-          </w:tblCellMar>
-        </w:tblPrEx>
         <w:tc>
           <w:tcPr>
             <w:tcW w:w="2000" w:type="pct"/>
@@ -5981,6 +5982,7 @@
   <w:style w:type="character" w:default="1" w:styleId="DefaultParagraphFont">
     <w:name w:val="Default Paragraph Font"/>
     <w:uiPriority w:val="1"/>
+    <w:semiHidden/>
     <w:unhideWhenUsed/>
   </w:style>
   <w:style w:type="table" w:default="1" w:styleId="TableNormal">

</xml_diff>